<commit_message>
Recast first ARB deck as a 35-minute visual walk
Replace the 23-slide text inventory with 13 talk slides plus 2 appendix.
Narrative is problem, R0 outcome, then how the architecture works — not a
bank-vs-new catalogue. Talk ~35 minutes so a 60-minute slot has room for
the board. Speaker notes and FAQ still hold the density. HA-02 unchanged.

Co-authored-by: mh.narkar <mh.narkar@gmail.com>
</commit_message>
<xml_diff>
--- a/docs/architecture/arb-prerequisites/exports/AU-NIP-R0-ARB-First-Review-SCRIPT-2026-09-14.docx
+++ b/docs/architecture/arb-prerequisites/exports/AU-NIP-R0-ARB-First-Review-SCRIPT-2026-09-14.docx
@@ -7,7 +7,7 @@
         <w:pStyle w:val="Title"/>
       </w:pPr>
       <w:r>
-        <w:t>NIP first ARB review — presenter script</w:t>
+        <w:t>NIP first ARB — 35-minute walk</w:t>
       </w:r>
     </w:p>
     <w:p>
@@ -16,12 +16,12 @@
           <w:b/>
           <w:color w:val="B91C1C"/>
         </w:rPr>
-        <w:t>FIRST REVIEW — DEV/UAT environment shape. Not production go-live, not DR-ready sign-off, not T4, not Board 4, not CIS register, not VA/PT.</w:t>
+        <w:t>Talk ~35 minutes. Leave ~25 for the board. Do not fill the hour.</w:t>
       </w:r>
     </w:p>
     <w:p>
       <w:r>
-        <w:t>Use PowerPoint presenter view. Each slide's notes match this document. Do not walk in with Markdown. Print this Word/PDF and keep the FAQ Excel beside you.</w:t>
+        <w:t>Use presenter view. Slides are billboards — do not read them. The argument is in these notes. Print this and keep the FAQ Excel beside you.</w:t>
       </w:r>
     </w:p>
     <w:p>
@@ -29,7 +29,7 @@
         <w:pStyle w:val="Heading1"/>
       </w:pPr>
       <w:r>
-        <w:t>Before you enter (5 minutes)</w:t>
+        <w:t>Before you enter</w:t>
       </w:r>
     </w:p>
     <w:p>
@@ -37,7 +37,7 @@
         <w:pStyle w:val="ListNumber"/>
       </w:pPr>
       <w:r>
-        <w:t>Open the First-Review PPTX, not the 19-row walk-in deck. That walk-in is the leave-behind.</w:t>
+        <w:t>Open the First-Review PPTX, not the 19-row leave-behind.</w:t>
       </w:r>
     </w:p>
     <w:p>
@@ -45,7 +45,7 @@
         <w:pStyle w:val="ListNumber"/>
       </w:pPr>
       <w:r>
-        <w:t>Print the FAQ Excel or keep it on a second screen.</w:t>
+        <w:t>Write a return date (for example five working days) on a card for Play 3.</w:t>
       </w:r>
     </w:p>
     <w:p>
@@ -53,7 +53,7 @@
         <w:pStyle w:val="ListNumber"/>
       </w:pPr>
       <w:r>
-        <w:t>Write today's date and 'Shivanshi / Deepali / Apigee team' on a notepad for Play 3.</w:t>
+        <w:t>Never say the architecture was invented by AI. Cite ADR-018, ADR-020, LLD, SAD.</w:t>
       </w:r>
     </w:p>
     <w:p>
@@ -61,7 +61,7 @@
         <w:pStyle w:val="ListNumber"/>
       </w:pPr>
       <w:r>
-        <w:t>Decide the return date you will offer (for example 'five working days') before you are asked.</w:t>
+        <w:t>If a network term appears, skip to the appendix row. Do not bluff BGP.</w:t>
       </w:r>
     </w:p>
     <w:p>
@@ -69,15 +69,7 @@
         <w:pStyle w:val="ListNumber"/>
       </w:pPr>
       <w:r>
-        <w:t>Never say you used AI to invent the architecture. Say: design is recorded in ADR-018 and ADR-020, LLD and SAD.</w:t>
-      </w:r>
-    </w:p>
-    <w:p>
-      <w:pPr>
-        <w:pStyle w:val="ListNumber"/>
-      </w:pPr>
-      <w:r>
-        <w:t>If you freeze on a network term, go to Appendix A in the deck. Read the one-sentence row.</w:t>
+        <w:t>After the topology picture, pause. After Decision requested, stop.</w:t>
       </w:r>
     </w:p>
     <w:p>
@@ -85,27 +77,21 @@
         <w:pStyle w:val="Heading1"/>
       </w:pPr>
       <w:r>
-        <w:t>Opening — 60 seconds (memorise)</w:t>
+        <w:t>Opening — 45 seconds</w:t>
       </w:r>
     </w:p>
     <w:p>
       <w:r>
-        <w:t>Thank you. This is the first Architecture Review Board sitting for the Insurance Distribution Platform — NIP.</w:t>
+        <w:t>Good morning. This is the first architecture review of the Insurance Distribution Platform.</w:t>
         <w:br/>
         <w:br/>
-        <w:t>We are not here for production go-live, and we are not here for DR-ready sign-off. Those will be later, fuller sittings.</w:t>
+        <w:t>The slot is sixty minutes. I will take about thirty-five to walk the problem, the outcome we are building, and how this architecture does it. The remainder is for you — questions, observations, improvements.</w:t>
         <w:br/>
         <w:br/>
-        <w:t>Today we ask you to review the architecture we intend to build, confirm it is aligned with bank platform standards, and allow us to stand up Dev and UAT — Dev lives inside the UAT AWS account — so engineering can proceed.</w:t>
+        <w:t>We are not seeking production authority today. We are seeking a recorded review of the intended design so Dev and UAT can be stood up.</w:t>
         <w:br/>
         <w:br/>
-        <w:t>I will walk one complete sale, then the cloud and network shape, then security, identity, data, audit, and DR as designed. I will be explicit about what is already bank-standard, what is different and why, and what we are still waiting on from other teams.</w:t>
-        <w:br/>
-        <w:br/>
-        <w:t>If a question needs a measured answer we do not have in the room — for example an Apigee IP list — I will record it as an action rather than guess. That kind of item should not block the Dev/UAT environment shape.</w:t>
-        <w:br/>
-        <w:br/>
-        <w:t>Sixty minutes. Comments welcome. We will park anything that belongs to the production ARB.</w:t>
+        <w:t>If a question needs a measured number we do not have, I will take it as a dated action. I will not guess an IP, a restore time, or a pentest result.</w:t>
       </w:r>
     </w:p>
     <w:p>
@@ -113,7 +99,7 @@
         <w:pStyle w:val="Heading1"/>
       </w:pPr>
       <w:r>
-        <w:t>Five professional plays when you do not know</w:t>
+        <w:t>Five plays when you do not know</w:t>
       </w:r>
     </w:p>
     <w:p>
@@ -160,12 +146,12 @@
         <w:pStyle w:val="Heading2"/>
       </w:pPr>
       <w:r>
-        <w:t>Play 4 — Wrong sitting</w:t>
+        <w:t>Play 4 — Later sitting</w:t>
       </w:r>
     </w:p>
     <w:p>
       <w:r>
-        <w:t>That is a production / DR-readiness / VA-PT question. We will bring it to the second ARB with evidence. Today is the first review of the intended design so we can stand up Dev and UAT.</w:t>
+        <w:t>That is a production, DR-readiness or VA-PT question. We will bring evidence to the second ARB. Today is the intended design, so Dev and UAT can be stood up.</w:t>
       </w:r>
     </w:p>
     <w:p>
@@ -194,7 +180,7 @@
         <w:pStyle w:val="Heading2"/>
       </w:pPr>
       <w:r>
-        <w:t>Slide 1. First ARB review — Dev &amp; UAT  (3 min · running 3)</w:t>
+        <w:t>Slide 1. Title  (1 min · running 1)</w:t>
       </w:r>
     </w:p>
     <w:p>
@@ -207,22 +193,16 @@
     </w:p>
     <w:p>
       <w:r>
-        <w:t>Thank you. This is the first Architecture Review Board sitting for the Insurance Distribution Platform — NIP.</w:t>
+        <w:t>Good morning. This is the first architecture review of the Insurance Distribution Platform.</w:t>
         <w:br/>
         <w:br/>
-        <w:t>We are not here for production go-live, and we are not here for DR-ready sign-off. Those will be later, fuller sittings.</w:t>
+        <w:t>The slot is sixty minutes. I will take about thirty-five to walk the problem, the outcome we are building, and how this architecture does it. The remainder is for you — questions, observations, improvements.</w:t>
         <w:br/>
         <w:br/>
-        <w:t>Today we ask you to review the architecture we intend to build, confirm it is aligned with bank platform standards, and allow us to stand up Dev and UAT — Dev lives inside the UAT AWS account — so engineering can proceed.</w:t>
+        <w:t>We are not seeking production authority today. We are seeking a recorded review of the intended design so Dev and UAT can be stood up.</w:t>
         <w:br/>
         <w:br/>
-        <w:t>I will walk one complete sale, then the cloud and network shape, then security, identity, data, audit, and DR as designed. I will be explicit about what is already bank-standard, what is different and why, and what we are still waiting on from other teams.</w:t>
-        <w:br/>
-        <w:br/>
-        <w:t>If a question needs a measured answer we do not have in the room — for example an Apigee IP list — I will record it as an action rather than guess. That kind of item should not block the Dev/UAT environment shape.</w:t>
-        <w:br/>
-        <w:br/>
-        <w:t>Sixty minutes. Comments welcome. We will park anything that belongs to the production ARB.</w:t>
+        <w:t>If a question needs a measured number we do not have, I will take it as a dated action. I will not guess an IP, a restore time, or a pentest result.</w:t>
       </w:r>
     </w:p>
     <w:p>
@@ -235,7 +215,7 @@
     </w:p>
     <w:p>
       <w:r>
-        <w:t>If someone asks 'is this production approval?' — No. Say it twice. Write it on the parking lot.</w:t>
+        <w:t>If someone asks whether this is production approval — no. Say it once, write it on the parking lot, keep walking.</w:t>
       </w:r>
     </w:p>
     <w:p>
@@ -248,7 +228,7 @@
     </w:p>
     <w:p>
       <w:r>
-        <w:t>Do not say 'AI designed this'. Do not say 'we need production'. Do not apologise for the architecture.</w:t>
+        <w:t>Do not say the architecture was designed by AI. Do not apologise for the design. Do not promise production in the same breath as Dev.</w:t>
       </w:r>
     </w:p>
     <w:p>
@@ -256,47 +236,7 @@
         <w:pStyle w:val="Heading2"/>
       </w:pPr>
       <w:r>
-        <w:t>Slide 2. Why we are here — and what we are not asking  (3 min · running 6)</w:t>
-      </w:r>
-    </w:p>
-    <w:p>
-      <w:pPr>
-        <w:pStyle w:val="ListBullet"/>
-      </w:pPr>
-      <w:r>
-        <w:t>This is the FIRST review. We are introducing NIP: a bank-owned insurance distribution platform for assisted Life.</w:t>
-      </w:r>
-    </w:p>
-    <w:p>
-      <w:pPr>
-        <w:pStyle w:val="ListBullet"/>
-      </w:pPr>
-      <w:r>
-        <w:t>ASK TODAY: review the intended architecture; non-objection to stand up Dev (inside UAT) and UAT.</w:t>
-      </w:r>
-    </w:p>
-    <w:p>
-      <w:pPr>
-        <w:pStyle w:val="ListBullet"/>
-      </w:pPr>
-      <w:r>
-        <w:t>NOT TODAY: production go-live · DR-ready sign-off · CIS register entry · VA/PT waiver · public ALB exception.</w:t>
-      </w:r>
-    </w:p>
-    <w:p>
-      <w:pPr>
-        <w:pStyle w:val="ListBullet"/>
-      </w:pPr>
-      <w:r>
-        <w:t>A later, fuller ARB will cover production and DR evidence (timed restore, VA/PT, proven RTO/RPO).</w:t>
-      </w:r>
-    </w:p>
-    <w:p>
-      <w:pPr>
-        <w:pStyle w:val="ListBullet"/>
-      </w:pPr>
-      <w:r>
-        <w:t>We want comments and improvements. Silence is not approval. A question is not a blocker unless you name it as one.</w:t>
+        <w:t>Slide 2. Purpose of this sitting  (1 min · running 2)</w:t>
       </w:r>
     </w:p>
     <w:p>
@@ -309,7 +249,7 @@
     </w:p>
     <w:p>
       <w:r>
-        <w:t>Please look at the two columns in your mind: today versus later. Today is design review plus Dev/UAT. Later is production and DR. If a comment is really a production control, I will park it for the second sitting so we do not spend the hour there.</w:t>
+        <w:t>Thirty-five minutes from me so that twenty-five remain for the board. I will show the problem, the R0 outcome, then how a sale, a session, a partner call, identity, money and recovery actually work. Please hold deep dives until the discussion — I will pause after the topology picture if the room is already there.</w:t>
       </w:r>
     </w:p>
     <w:p>
@@ -322,7 +262,7 @@
     </w:p>
     <w:p>
       <w:r>
-        <w:t>If they say 'we only ARB once' — we still cannot evidence DR or VA/PT today. We are asking for a staged review, which matches how landing zones are vended.</w:t>
+        <w:t>If they want network first, skip to 'How a session reaches the application'. The problem slide can wait two minutes.</w:t>
       </w:r>
     </w:p>
     <w:p>
@@ -335,7 +275,7 @@
     </w:p>
     <w:p>
       <w:r>
-        <w:t>Do not accept 'approve everything now'. Do not accept 'come back when prod-ready' if that blocks Dev/UAT — that is the chicken-and-egg.</w:t>
+        <w:t>Do not read a table of timings aloud. Point at the two clocks and move.</w:t>
       </w:r>
     </w:p>
     <w:p>
@@ -343,7 +283,7 @@
         <w:pStyle w:val="Heading2"/>
       </w:pPr>
       <w:r>
-        <w:t>Slide 3. 60 minutes — how we will use them  (1 min · running 7)</w:t>
+        <w:t>Slide 3. Why this platform exists  (3 min · running 5)</w:t>
       </w:r>
     </w:p>
     <w:p>
@@ -356,7 +296,7 @@
     </w:p>
     <w:p>
       <w:r>
-        <w:t>I will keep moving. Please park deep dives. Appendix slides at the back are glossary and FAQ — we open them only if needed.</w:t>
+        <w:t>This is an insurance distribution problem, not a hosting problem. We hold a composite corporate-agency licence. If we cannot show suitability, customer consent, customer-device payment and a reconciled policy, we do not have a sale we can stand behind. That is why we are not wrapping someone else's portal.</w:t>
       </w:r>
     </w:p>
     <w:p>
@@ -369,7 +309,7 @@
     </w:p>
     <w:p>
       <w:r>
-        <w:t>If they want to jump to network first — agree. Skip to the front-door slide. The sale trace can wait 2 minutes.</w:t>
+        <w:t>Health, Motor and DIY are later horizons. Do not design them in this sitting.</w:t>
       </w:r>
     </w:p>
     <w:p>
@@ -382,7 +322,7 @@
     </w:p>
     <w:p>
       <w:r>
-        <w:t>Do not read this table aloud line by line.</w:t>
+        <w:t>Do not invent a Product signature. Rajal owns volumes and business sign-off.</w:t>
       </w:r>
     </w:p>
     <w:p>
@@ -390,47 +330,7 @@
         <w:pStyle w:val="Heading2"/>
       </w:pPr>
       <w:r>
-        <w:t>Slide 4. Business — what NIP is (row 1 of the pack)  (4 min · running 11)</w:t>
-      </w:r>
-    </w:p>
-    <w:p>
-      <w:pPr>
-        <w:pStyle w:val="ListBullet"/>
-      </w:pPr>
-      <w:r>
-        <w:t>AU Bank holds IRDAI Composite Corporate Agency licence CA0515.</w:t>
-      </w:r>
-    </w:p>
-    <w:p>
-      <w:pPr>
-        <w:pStyle w:val="ListBullet"/>
-      </w:pPr>
-      <w:r>
-        <w:t>R0: one Relationship Manager, as certified Specified Person, sells Term or Savings/ULIP to one ETB customer of one Group A insurer — end to end.</w:t>
-      </w:r>
-    </w:p>
-    <w:p>
-      <w:pPr>
-        <w:pStyle w:val="ListBullet"/>
-      </w:pPr>
-      <w:r>
-        <w:t>Non-bypassable: suitability (C1), customer-device OTP consent (C2), customer-device payment (C4), reconciled issuance, immutable 7-year audit.</w:t>
-      </w:r>
-    </w:p>
-    <w:p>
-      <w:pPr>
-        <w:pStyle w:val="ListBullet"/>
-      </w:pPr>
-      <w:r>
-        <w:t>Why not redirect to an aggregator portal: we lose evidence, suitability, and the ability to replace the aggregator.</w:t>
-      </w:r>
-    </w:p>
-    <w:p>
-      <w:pPr>
-        <w:pStyle w:val="ListBullet"/>
-      </w:pPr>
-      <w:r>
-        <w:t>Product volumes (CAP-A*) are still assumptions — Rajal. That does not change the Dev/UAT network shape.</w:t>
+        <w:t>Slide 4. What R0 must deliver  (2 min · running 7)</w:t>
       </w:r>
     </w:p>
     <w:p>
@@ -443,7 +343,7 @@
     </w:p>
     <w:p>
       <w:r>
-        <w:t>This is an insurance distribution platform owned by the bank, not a 1SilverBullet skin. 1SB is a provider route we can replace. The RM never pays on the RM device. The customer pays on the customer's device. If we get that wrong, we do not have an IRDAI-safe journey.</w:t>
+        <w:t>R0 is narrow on purpose: one RM, one ETB customer, one Group A insurer, assisted Life. Depth over breadth. The five bars on this slide are not features — they are gates. If a shortcut skips one of them, it is not a simplification.</w:t>
       </w:r>
     </w:p>
     <w:p>
@@ -456,7 +356,7 @@
     </w:p>
     <w:p>
       <w:r>
-        <w:t>Health / Motor / DIY are later horizons. Do not design them in this hour. H1–H3 are direction, not this submission.</w:t>
+        <w:t>Volumes are still Product assumptions. They do not change the Dev/UAT network shape.</w:t>
       </w:r>
     </w:p>
     <w:p>
@@ -469,7 +369,7 @@
     </w:p>
     <w:p>
       <w:r>
-        <w:t>Do not invent a business BRD signature. Rajal owns Product sign-off.</w:t>
+        <w:t>Do not expand into DIY, hybrid, or a second line of business to look more complete.</w:t>
       </w:r>
     </w:p>
     <w:p>
@@ -477,47 +377,7 @@
         <w:pStyle w:val="Heading2"/>
       </w:pPr>
       <w:r>
-        <w:t>Slide 5. One sale, end to end — follow Priya  (5 min · running 16)</w:t>
-      </w:r>
-    </w:p>
-    <w:p>
-      <w:pPr>
-        <w:pStyle w:val="ListBullet"/>
-      </w:pPr>
-      <w:r>
-        <w:t>Priya's device → Cloudflare → F5-XC → API Gateway → Internal ALB → Flutter web or NIP BFF.</w:t>
-      </w:r>
-    </w:p>
-    <w:p>
-      <w:pPr>
-        <w:pStyle w:val="ListBullet"/>
-      </w:pPr>
-      <w:r>
-        <w:t>BFF holds tokens. Device holds an opaque session only. PDP fail-closed before regulated actions.</w:t>
-      </w:r>
-    </w:p>
-    <w:p>
-      <w:pPr>
-        <w:pStyle w:val="ListBullet"/>
-      </w:pPr>
-      <w:r>
-        <w:t>Lead create is the only on-platform way in. CIF via bank EBS. Suitability before quote. OTP on the customer phone.</w:t>
-      </w:r>
-    </w:p>
-    <w:p>
-      <w:pPr>
-        <w:pStyle w:val="ListBullet"/>
-      </w:pPr>
-      <w:r>
-        <w:t>Quote/proposal: Hub → 1SB adapter → Apigee → 1SB. 1SB JSON dies in the adapter.</w:t>
-      </w:r>
-    </w:p>
-    <w:p>
-      <w:pPr>
-        <w:pStyle w:val="ListBullet"/>
-      </w:pPr>
-      <w:r>
-        <w:t>Payment link to the customer device. Callback on a separate API Gateway route. Policy only after RECONCILED + audit write.</w:t>
+        <w:t>Slide 5. How one sale completes  (5 min · running 12)</w:t>
       </w:r>
     </w:p>
     <w:p>
@@ -530,7 +390,7 @@
     </w:p>
     <w:p>
       <w:r>
-        <w:t>Forget boxes for one minute. This trace IS the architecture. Flutter never calls 1SB, never calls RDS, never calls Apigee. Customer phone appears twice: OTP and pay. If someone proposes a shortcut that skips suitability, consent, customer-device pay, or audit-before-sold — that is not a simplification, that is a control failure.</w:t>
+        <w:t>Forget boxes for a moment — this sequence is the architecture. Flutter never calls the aggregator, never calls the database, never calls Apigee. The customer phone appears twice: OTP and pay. If someone proposes collapsing quote and suitability into one service to look smaller, that is a control failure dressed as simplicity.</w:t>
       </w:r>
     </w:p>
     <w:p>
@@ -543,7 +403,7 @@
     </w:p>
     <w:p>
       <w:r>
-        <w:t>Why so many services? Because Health later must not rewrite Life. Quote and suitability are different systems of record. We will not merge them to look smaller on a slide.</w:t>
+        <w:t>Why several services? Because a later Health journey must not rewrite Life. Different systems of record stay different.</w:t>
       </w:r>
     </w:p>
     <w:p>
@@ -556,7 +416,7 @@
     </w:p>
     <w:p>
       <w:r>
-        <w:t>Do not demo a god-service. Do not say Kafka is the audit log.</w:t>
+        <w:t>Do not call Kafka the audit log. Do not accept RM-pays-for-the-customer as a UAT exception.</w:t>
       </w:r>
     </w:p>
     <w:p>
@@ -564,47 +424,7 @@
         <w:pStyle w:val="Heading2"/>
       </w:pPr>
       <w:r>
-        <w:t>Slide 6. Front door — inbound (ADR-018)  |  why not a public ALB  (6 min · running 22)</w:t>
-      </w:r>
-    </w:p>
-    <w:p>
-      <w:pPr>
-        <w:pStyle w:val="ListBullet"/>
-      </w:pPr>
-      <w:r>
-        <w:t>Bank north-south SaaS already exists: Cloudflare Enterprise, then F5-XC WAF. We consume them. We do not clone them.</w:t>
-      </w:r>
-    </w:p>
-    <w:p>
-      <w:pPr>
-        <w:pStyle w:val="ListBullet"/>
-      </w:pPr>
-      <w:r>
-        <w:t>First AWS hop: Amazon API Gateway (schema, throttle, no business logic) → VPC Link → Internal ALB only.</w:t>
-      </w:r>
-    </w:p>
-    <w:p>
-      <w:pPr>
-        <w:pStyle w:val="ListBullet"/>
-      </w:pPr>
-      <w:r>
-        <w:t>No public / external ALB. No Internet Gateway on a workload VPC. You cannot curl a pod from the internet.</w:t>
-      </w:r>
-    </w:p>
-    <w:p>
-      <w:pPr>
-        <w:pStyle w:val="ListBullet"/>
-      </w:pPr>
-      <w:r>
-        <w:t>Neighbour bank apps often enter AWS on a Public ALB. We did not copy that (Board 1 F-06). API Gateway is our AWS entry.</w:t>
-      </w:r>
-    </w:p>
-    <w:p>
-      <w:pPr>
-        <w:pStyle w:val="ListBullet"/>
-      </w:pPr>
-      <w:r>
-        <w:t>Payment callbacks: a separate API Gateway route, IP-allowlisted to the PG — not on the RM session (TB-6).</w:t>
+        <w:t>Slide 6. How a session reaches the application  (4 min · running 16)</w:t>
       </w:r>
     </w:p>
     <w:p>
@@ -617,7 +437,7 @@
     </w:p>
     <w:p>
       <w:r>
-        <w:t>This will attract the most questions. The one-line answer: a public ALB in front of API Gateway is an extra attack surface and an extra hop the insurance platform does not need. Cloudflare and F5 are already the bank perimeter, and they are SaaS — they do not sit in our VPC. Internal ALB is the only load balancer inside the VPC. If the room wants the neighbour app's Public ALB copied, that is a change to ADR-018, not a tweak. It would also require Deepali, not just Architecture.</w:t>
+        <w:t>A session is terminated at the edge, then at API Gateway, then at an internal load balancer. You cannot curl a pod from the internet — that is intentional. If the room asks why not a public ALB, the one-line answer is: it would add a public target in front of a front door we already have. That is ADR-018. Changing it is a Deepali exposure decision, not a Dev convenience. Do not agree to a public ALB 'just for Dev'.</w:t>
       </w:r>
     </w:p>
     <w:p>
@@ -630,7 +450,7 @@
     </w:p>
     <w:p>
       <w:r>
-        <w:t>Use FAQ 1–3. If they insist, Play 2: Deepali owns the exposure outcome. Play 3: we will not redesign the front door in the last twenty minutes.</w:t>
+        <w:t>Use FAQ on public ALB. Play 2 if they insist. Play 3 if they want a redesign in the last twenty minutes.</w:t>
       </w:r>
     </w:p>
     <w:p>
@@ -643,7 +463,7 @@
     </w:p>
     <w:p>
       <w:r>
-        <w:t>Do not agree to 'just a public ALB for Dev'. Dev that is public is a prod-shaped hole with synthetic data until someone puts a real CIF in it.</w:t>
+        <w:t>Do not contrast this with neighbour applications on the slide. Answer that only if asked, from the notes.</w:t>
       </w:r>
     </w:p>
     <w:p>
@@ -651,7 +471,7 @@
         <w:pStyle w:val="Heading2"/>
       </w:pPr>
       <w:r>
-        <w:t>Slide 7. Where it runs — attach, do not clone  (4 min · running 26)</w:t>
+        <w:t>Slide 7. How the platform calls a partner  (3 min · running 19)</w:t>
       </w:r>
     </w:p>
     <w:p>
@@ -664,7 +484,7 @@
     </w:p>
     <w:p>
       <w:r>
-        <w:t>This is the R0 topology. Please notice three things. One: we attach as a spoke to the existing AU-CTO-NETWORK Transit Gateway — we do not build a second hub, a second Direct Connect, or a FortiGate pair in our VPC. Two: inbound is Cloudflare / F5 / API Gateway. Three: outbound leaves via Apigee. The picture is a rendering of the LLD. If it disagrees with an ADR, the ADR wins.</w:t>
+        <w:t>Two different outsides. Mixing them is how CIF ends up on the public internet. The adapter's base URL is the Apigee proxy, not the aggregator host. Publishing NAT Elastic IPs to 1SB allowlists the wrong host — ADR-020. I will not read out an IP list; that action sits with the Apigee team and does not block vpc-dev.</w:t>
       </w:r>
     </w:p>
     <w:p>
@@ -677,7 +497,7 @@
     </w:p>
     <w:p>
       <w:r>
-        <w:t>If they cannot read the picture, go to the next two slides which are the same facts in words.</w:t>
+        <w:t>Apigee edition and IPs: Play 3, DEP-20260914-apg. Dev uses stubs.</w:t>
       </w:r>
     </w:p>
     <w:p>
@@ -690,7 +510,7 @@
     </w:p>
     <w:p>
       <w:r>
-        <w:t>Do not apologise that it is busy. Offer the LLD after the meeting.</w:t>
+        <w:t>Do not promise the Apigee product exists today. Do not invent IPs.</w:t>
       </w:r>
     </w:p>
     <w:p>
@@ -698,47 +518,7 @@
         <w:pStyle w:val="Heading2"/>
       </w:pPr>
       <w:r>
-        <w:t>Slide 8. Loading dock — outbound (ADR-020)  |  why not NAT EIPs to 1SB  (5 min · running 31)</w:t>
-      </w:r>
-    </w:p>
-    <w:p>
-      <w:pPr>
-        <w:pStyle w:val="ListBullet"/>
-      </w:pPr>
-      <w:r>
-        <w:t>Every call that leaves the building goes via bank Apigee: 1SB, SMS, PG session-create, AD-verify, EBS.</w:t>
-      </w:r>
-    </w:p>
-    <w:p>
-      <w:pPr>
-        <w:pStyle w:val="ListBullet"/>
-      </w:pPr>
-      <w:r>
-        <w:t>Java never calls *.1silverbullet.tech. Adapter base URL = Apigee proxy. 1SB allowlists Apigee IPs.</w:t>
-      </w:r>
-    </w:p>
-    <w:p>
-      <w:pPr>
-        <w:pStyle w:val="ListBullet"/>
-      </w:pPr>
-      <w:r>
-        <w:t>Internal bank APIs use Apigee private targets. Forbidden: hairpin through Cloudflare and F5.</w:t>
-      </w:r>
-    </w:p>
-    <w:p>
-      <w:pPr>
-        <w:pStyle w:val="ListBullet"/>
-      </w:pPr>
-      <w:r>
-        <w:t>Spoke NAT Gateways still exist on the inspection path toward Apigee. Publishing those EIPs to 1SB is now the defect.</w:t>
-      </w:r>
-    </w:p>
-    <w:p>
-      <w:pPr>
-        <w:pStyle w:val="ListBullet"/>
-      </w:pPr>
-      <w:r>
-        <w:t>Pod → TGW → Network Firewall → Apigee. Firewall remainder is Deepali's acceptance (ADR-010), not an allowlist.</w:t>
+        <w:t>Slide 8. Where a request runs  (3 min · running 22)</w:t>
       </w:r>
     </w:p>
     <w:p>
@@ -751,7 +531,7 @@
     </w:p>
     <w:p>
       <w:r>
-        <w:t>Two different outsides. Mixing them is how CIF ends up on the public internet. Bank systems stay private. Internet partners go through Apigee. If someone says 'just whitelist our NAT IPs like last year' — that allowlists the wrong host. 1SB will see Apigee, not our NAT.</w:t>
+        <w:t>This is the runtime picture. Three facts: we attach as a spoke — we do not build a second hub. Inbound is the path you just saw. Outbound leaves through Apigee. The picture is a rendering of the LLD. If it disagrees with an ADR, the ADR wins. I will pause here if you want to interrogate the drawing; otherwise I will keep moving so we protect discussion time.</w:t>
       </w:r>
     </w:p>
     <w:p>
@@ -764,7 +544,7 @@
     </w:p>
     <w:p>
       <w:r>
-        <w:t>Apigee edition and exact IPs are still with the Apigee team (DEP-20260914-apg). Play 3. Dev can use stubs; UAT needs the private path or a dated exception — Shivanshi.</w:t>
+        <w:t>If the drawing is too busy, the previous two slides are the same facts in sequence.</w:t>
       </w:r>
     </w:p>
     <w:p>
@@ -777,7 +557,7 @@
     </w:p>
     <w:p>
       <w:r>
-        <w:t>Do not read out an IP. Do not promise the Apigee product exists today.</w:t>
+        <w:t>Do not walk every box. Offer the LLD after the sitting.</w:t>
       </w:r>
     </w:p>
     <w:p>
@@ -785,7 +565,7 @@
         <w:pStyle w:val="Heading2"/>
       </w:pPr>
       <w:r>
-        <w:t>Slide 9. Five accounts — Dev inside UAT — no CUG  (3 min · running 34)</w:t>
+        <w:t>Slide 9. How Dev and UAT are isolated  (2 min · running 24)</w:t>
       </w:r>
     </w:p>
     <w:p>
@@ -798,7 +578,7 @@
     </w:p>
     <w:p>
       <w:r>
-        <w:t>Bank onboarding default is Prod, CUG, UAT, with Dev inside UAT. We are not asking for a separate Dev account. We are not asking for CUG at R0 — waiver, do not provision. Isolation is two VPCs, namespaces, schemas, Valkey prefixes, Apigee products. That is how we keep cost down without mixing stub CBS and real CBS.</w:t>
+        <w:t>Five accounts. Dev is not a sixth account — it is a VPC inside UAT, with its own route table, namespaces and schemas, so stubs cannot ride a production CBS route. CUG is not in R0; there is no consumer for it. Production is on this picture so you can see blast radius — we are not asking to vendor it today.</w:t>
       </w:r>
     </w:p>
     <w:p>
@@ -811,7 +591,7 @@
     </w:p>
     <w:p>
       <w:r>
-        <w:t>If Cloud wants a split Dev account — that is a cost exception they own. We can consume it; we are not requesting it. CUG has no R0 consumer.</w:t>
+        <w:t>A split Dev account is a Cloud cost exception we are not requesting. We can consume it; we are not asking for it.</w:t>
       </w:r>
     </w:p>
     <w:p>
@@ -824,7 +604,7 @@
     </w:p>
     <w:p>
       <w:r>
-        <w:t>Do not offer to vendor prod in the same request 'while we are here'.</w:t>
+        <w:t>Do not offer to vendor production 'while we are here'.</w:t>
       </w:r>
     </w:p>
     <w:p>
@@ -832,47 +612,7 @@
         <w:pStyle w:val="Heading2"/>
       </w:pPr>
       <w:r>
-        <w:t>Slide 10. Security architecture — seven trust boundaries  (4 min · running 38)</w:t>
-      </w:r>
-    </w:p>
-    <w:p>
-      <w:pPr>
-        <w:pStyle w:val="ListBullet"/>
-      </w:pPr>
-      <w:r>
-        <w:t>TB-1 device→edge · TB-2 edge→BFF · TB-3 BFF→PDP · TB-4 app→data · TB-5 adapter→Apigee→1SB · TB-6 payment · TB-7 private bank.</w:t>
-      </w:r>
-    </w:p>
-    <w:p>
-      <w:pPr>
-        <w:pStyle w:val="ListBullet"/>
-      </w:pPr>
-      <w:r>
-        <w:t>This document is Architecture's input to Board 4. Deepali signs the threat model. We are not signing it today.</w:t>
-      </w:r>
-    </w:p>
-    <w:p>
-      <w:pPr>
-        <w:pStyle w:val="ListBullet"/>
-      </w:pPr>
-      <w:r>
-        <w:t>No PII in logs — pipeline fails. Secrets via IRSA / Secrets Manager, not in images.</w:t>
-      </w:r>
-    </w:p>
-    <w:p>
-      <w:pPr>
-        <w:pStyle w:val="ListBullet"/>
-      </w:pPr>
-      <w:r>
-        <w:t>mTLS to 1SB is passed intact; we do not decrypt it at a firewall to 'inspect'.</w:t>
-      </w:r>
-    </w:p>
-    <w:p>
-      <w:pPr>
-        <w:pStyle w:val="ListBullet"/>
-      </w:pPr>
-      <w:r>
-        <w:t>VA/PT is NOT-YET. SAST, ArchUnit, JaCoCo, lockfile SCA are in CI now. Pentest is a UAT-exit / production-ARB item.</w:t>
+        <w:t>Slide 10. How identity, records and exposure are handled  (3 min · running 27)</w:t>
       </w:r>
     </w:p>
     <w:p>
@@ -885,7 +625,7 @@
     </w:p>
     <w:p>
       <w:r>
-        <w:t>If Security asks 'where is the VA/PT report?' the honest answer is: there is none, and we will not claim there is. Dev/UAT can be stood up with SAST in CI. Production ARB will not. Please do not hold Dev/UAT for a pentest of an environment that does not exist yet.</w:t>
+        <w:t>Please do not let anyone treat the search cluster as the audit pack. Search can be rebuilt. WORM cannot be shortened because we are in a hurry. We are not binding LDAP from Kubernetes to Active Directory — that would be a new credential path. VA/PT does not exist yet; we will not pentest an environment we have not been allowed to vendor.</w:t>
       </w:r>
     </w:p>
     <w:p>
@@ -898,7 +638,7 @@
     </w:p>
     <w:p>
       <w:r>
-        <w:t>Play 4 on pentest. Play 2 on ADR-010 firewall remainder.</w:t>
+        <w:t>CIS class is a proposal; Shailja and CISO register it. Play 2. Play 4 on pentest.</w:t>
       </w:r>
     </w:p>
     <w:p>
@@ -911,7 +651,7 @@
     </w:p>
     <w:p>
       <w:r>
-        <w:t>Do not say 'we will pentest next week' unless Swapnali/Deepali have a date.</w:t>
+        <w:t>Do not classify the system into the CIS register from this slide. Do not say pentest is next week unless a date exists.</w:t>
       </w:r>
     </w:p>
     <w:p>
@@ -919,47 +659,7 @@
         <w:pStyle w:val="Heading2"/>
       </w:pPr>
       <w:r>
-        <w:t>Slide 11. Identity — IAM and PAM  (3 min · running 41)</w:t>
-      </w:r>
-    </w:p>
-    <w:p>
-      <w:pPr>
-        <w:pStyle w:val="ListBullet"/>
-      </w:pPr>
-      <w:r>
-        <w:t>Workforce (RM): Bank AD remains source of truth (TI-01). We call the existing AD-verify API via Apigee private. Never LDAP from EKS.</w:t>
-      </w:r>
-    </w:p>
-    <w:p>
-      <w:pPr>
-        <w:pStyle w:val="ListBullet"/>
-      </w:pPr>
-      <w:r>
-        <w:t>Partners / IPR: created in the private IdP (Keycloak is acceptable). Never in AD.</w:t>
-      </w:r>
-    </w:p>
-    <w:p>
-      <w:pPr>
-        <w:pStyle w:val="ListBullet"/>
-      </w:pPr>
-      <w:r>
-        <w:t>NIP-APP / Fireframe is the UI chrome. Keycloak admin console is not shown to bank users.</w:t>
-      </w:r>
-    </w:p>
-    <w:p>
-      <w:pPr>
-        <w:pStyle w:val="ListBullet"/>
-      </w:pPr>
-      <w:r>
-        <w:t>Pods: IRSA per deployable. Humans on AWS: bank IAM Identity Center / existing PAM. We consume PAM; we do not invent a second one.</w:t>
-      </w:r>
-    </w:p>
-    <w:p>
-      <w:pPr>
-        <w:pStyle w:val="ListBullet"/>
-      </w:pPr>
-      <w:r>
-        <w:t>Flutter never talks to Keycloak or Apigee.</w:t>
+        <w:t>Slide 11. How premium is collected  (3 min · running 30)</w:t>
       </w:r>
     </w:p>
     <w:p>
@@ -972,7 +672,7 @@
     </w:p>
     <w:p>
       <w:r>
-        <w:t>The sentence that must survive this slide: we are not binding LDAP from Kubernetes to Active Directory. That would be a new attack path the bank does not need. AD-verify is an API the bank already has.</w:t>
+        <w:t>Session-create goes out through Apigee. The customer completes 3-D Secure on their own device. The callback arrives on a separate API Gateway route, not on the RM session. We do not mark sold because a payment API returned 200. We wait for reconciled. If the callback is lost, state is uncertain and we block a second attempt. Timeouts do not mint money.</w:t>
       </w:r>
     </w:p>
     <w:p>
@@ -985,7 +685,7 @@
     </w:p>
     <w:p>
       <w:r>
-        <w:t>Password-in-NIP vs Fireframe SSO is a joint item with Deepali (ID-11). Play 2. It does not change VPC vending.</w:t>
+        <w:t>PAN never on the RM device and never in our logs. We use the bank payment gateway; we do not replace it.</w:t>
       </w:r>
     </w:p>
     <w:p>
@@ -998,7 +698,7 @@
     </w:p>
     <w:p>
       <w:r>
-        <w:t>Do not offer to 'just LDAP for Dev'.</w:t>
+        <w:t>Do not accept 'RM pays on behalf for the UAT demo' as an architecture exception.</w:t>
       </w:r>
     </w:p>
     <w:p>
@@ -1006,47 +706,7 @@
         <w:pStyle w:val="Heading2"/>
       </w:pPr>
       <w:r>
-        <w:t>Slide 12. Data, residency, audit vs logs  (3 min · running 44)</w:t>
-      </w:r>
-    </w:p>
-    <w:p>
-      <w:pPr>
-        <w:pStyle w:val="ListBullet"/>
-      </w:pPr>
-      <w:r>
-        <w:t>Classes: PUBLIC / INTERNAL / CONFIDENTIAL / RESTRICTED. India only — ap-south-1 primary, ap-south-2 DR (TI-08).</w:t>
-      </w:r>
-    </w:p>
-    <w:p>
-      <w:pPr>
-        <w:pStyle w:val="ListBullet"/>
-      </w:pPr>
-      <w:r>
-        <w:t>Aurora PostgreSQL, one cluster, schema per bounded context (ADR-008). No cross-schema grants.</w:t>
-      </w:r>
-    </w:p>
-    <w:p>
-      <w:pPr>
-        <w:pStyle w:val="ListBullet"/>
-      </w:pPr>
-      <w:r>
-        <w:t>Audit is INSERT-only + S3 Object Lock. 7-year evidence. OpenSearch is operational logs, never evidence (ADR-013).</w:t>
-      </w:r>
-    </w:p>
-    <w:p>
-      <w:pPr>
-        <w:pStyle w:val="ListBullet"/>
-      </w:pPr>
-      <w:r>
-        <w:t>CloudTrail (who changed AWS) and CloudWatch (how the pod behaves) are both mandatory.</w:t>
-      </w:r>
-    </w:p>
-    <w:p>
-      <w:pPr>
-        <w:pStyle w:val="ListBullet"/>
-      </w:pPr>
-      <w:r>
-        <w:t>Cache / Kafka / search are not systems of record. Losing Valkey means re-login, not data loss.</w:t>
+        <w:t>Slide 12. Continuity — designed, not yet drilled  (2 min · running 32)</w:t>
       </w:r>
     </w:p>
     <w:p>
@@ -1059,7 +719,7 @@
     </w:p>
     <w:p>
       <w:r>
-        <w:t>Please do not let anyone treat Kibana as the audit pack. Search can be rebuilt. WORM cannot be shortened because we are in a hurry to decommission.</w:t>
+        <w:t>Three numbers, one caveat: we have not measured them in a drill. That is exactly why this is not the production ARB. Warm standby matches a one-hour RTO. Active-active is a different money and data problem — I will not 'fix' SOP language in this hour without Aarti and Shivanshi.</w:t>
       </w:r>
     </w:p>
     <w:p>
@@ -1072,7 +732,7 @@
     </w:p>
     <w:p>
       <w:r>
-        <w:t>CIS class is proposed Critical; Shailja + CISO register it. Architecture does not. Play 2. Dev/UAT still uses the same control set — we do not build a weaker Dev.</w:t>
+        <w:t>Play 4. NFR-DR-04 is the drill.</w:t>
       </w:r>
     </w:p>
     <w:p>
@@ -1085,7 +745,7 @@
     </w:p>
     <w:p>
       <w:r>
-        <w:t>Do not classify the system into the bank CIS register from this slide.</w:t>
+        <w:t>Do not claim DR is proven. Do not drop Hyderabad 'to save money' without Aarti.</w:t>
       </w:r>
     </w:p>
     <w:p>
@@ -1093,7 +753,7 @@
         <w:pStyle w:val="Heading2"/>
       </w:pPr>
       <w:r>
-        <w:t>Slide 13. Payment — customer device, not RM device (TB-6)  (3 min · running 47)</w:t>
+        <w:t>Slide 13. Decision requested  (2 min · running 34)</w:t>
       </w:r>
     </w:p>
     <w:p>
@@ -1106,7 +766,7 @@
     </w:p>
     <w:p>
       <w:r>
-        <w:t>Session-create goes out through Apigee. The customer completes 3-D Secure on their own device. The callback comes in on a separate API Gateway route, not on Priya's session. We do not mark SOLD because a payment API returned 200. We wait for RECONCILED. If the callback is lost, state is UNCERTAIN and we block a second attempt. Timeouts do not mint money.</w:t>
+        <w:t>The decision we are requesting: record this as the intended R0 design, and allow Dev and UAT to be provisioned on this shape. Production authority, DR proof and pentest belong to a later sitting. I will stop here so we can discuss.</w:t>
       </w:r>
     </w:p>
     <w:p>
@@ -1119,7 +779,7 @@
     </w:p>
     <w:p>
       <w:r>
-        <w:t>PAN never on the RM device and never in our logs. PG is the bank's existing payment gateway — we do not replace it.</w:t>
+        <w:t>If they will only write 'approved', ask them to qualify: first review, Dev/UAT vending, production ARB still required.</w:t>
       </w:r>
     </w:p>
     <w:p>
@@ -1132,7 +792,7 @@
     </w:p>
     <w:p>
       <w:r>
-        <w:t>Do not accept 'RM can pay on behalf for UAT demo' as an architecture exception.</w:t>
+        <w:t>Do not leave without a written observation, even if it is 'no objection to Dev/UAT, firewall remainder with Security'.</w:t>
       </w:r>
     </w:p>
     <w:p>
@@ -1140,7 +800,7 @@
         <w:pStyle w:val="Heading2"/>
       </w:pPr>
       <w:r>
-        <w:t>Slide 14. DR — designed for later; not the ask today  (3 min · running 50)</w:t>
+        <w:t>Slide 14. Appendix — network terms  (appendix)</w:t>
       </w:r>
     </w:p>
     <w:p>
@@ -1153,7 +813,7 @@
     </w:p>
     <w:p>
       <w:r>
-        <w:t>Warm standby in Hyderabad. RTO ≤ 1 hour, transactional RPO ≤ 5 minutes, audit RPO 0. Cache, MSK and OpenSearch are not replicated — by design. A DR region with no path to CBS cannot sell. We have not run the timed restore drill. That drill is a production/DR ARB evidence item (NFR-DR-04). Today we are not claiming DR-ready.</w:t>
+        <w:t>Open only if a network SME quizzes terms. You do not need BGP in this sitting.</w:t>
       </w:r>
     </w:p>
     <w:p>
@@ -1166,7 +826,7 @@
     </w:p>
     <w:p>
       <w:r>
-        <w:t>Why not active-active? Bank SOP language for some tiers is active-active. We do not 'fix' that without an RIA tier and Aarti/Shivanshi. Warm standby matches RTO 1 hour. Play 4.</w:t>
+        <w:t>Below this table — Play 3, with SRE and bank network.</w:t>
       </w:r>
     </w:p>
     <w:p>
@@ -1179,7 +839,7 @@
     </w:p>
     <w:p>
       <w:r>
-        <w:t>Do not say DR is proven. Do not skip Hyderabad in the design 'to save money' without Aarti.</w:t>
+        <w:t>Do not draw BGP on a whiteboard unless SRE is speaking.</w:t>
       </w:r>
     </w:p>
     <w:p>
@@ -1187,7 +847,7 @@
         <w:pStyle w:val="Heading2"/>
       </w:pPr>
       <w:r>
-        <w:t>Slide 15. Bank standard we consume  vs  what is different  (4 min · running 54)</w:t>
+        <w:t>Slide 15. Appendix — if you do not have the number  (appendix)</w:t>
       </w:r>
     </w:p>
     <w:p>
@@ -1200,20 +860,7 @@
     </w:p>
     <w:p>
       <w:r>
-        <w:t>Read the red lines as the only things that might look 'new'. Public ALB is the neighbour pattern we refused. CUG we are not buying. Separate Dev account we are not asking for. Everything else is attach-don't-clone. If ARB can live with those three differences, Dev/UAT can be vended without an architecture rewrite.</w:t>
-      </w:r>
-    </w:p>
-    <w:p>
-      <w:r>
-        <w:rPr>
-          <w:b/>
-        </w:rPr>
-        <w:t>IF ASKED</w:t>
-      </w:r>
-    </w:p>
-    <w:p>
-      <w:r>
-        <w:t>If they reject API Gateway inbound — that is a redesign, Deepali+Mahesh, not a hallway decision. Record it. Do not improvise a Public ALB 'for now'.</w:t>
+        <w:t>Memorise Play 3 and Play 5. Put them on a card in your pocket.</w:t>
       </w:r>
     </w:p>
     <w:p>
@@ -1226,444 +873,7 @@
     </w:p>
     <w:p>
       <w:r>
-        <w:t>Do not present differences as rebellion. Present them as recorded ADRs with owners.</w:t>
-      </w:r>
-    </w:p>
-    <w:p>
-      <w:pPr>
-        <w:pStyle w:val="Heading2"/>
-      </w:pPr>
-      <w:r>
-        <w:t>Slide 16. Tech stack (pins) — why these, not a catalogue  (3 min · running 57)</w:t>
-      </w:r>
-    </w:p>
-    <w:p>
-      <w:r>
-        <w:rPr>
-          <w:b/>
-        </w:rPr>
-        <w:t>SAY</w:t>
-      </w:r>
-    </w:p>
-    <w:p>
-      <w:r>
-        <w:t>We did not pick a fashion stack. We picked what the estate already runs and what keeps 1SB behind an adapter. A stack argument that does not change a control is a later conversation.</w:t>
-      </w:r>
-    </w:p>
-    <w:p>
-      <w:r>
-        <w:rPr>
-          <w:b/>
-        </w:rPr>
-        <w:t>IF ASKED</w:t>
-      </w:r>
-    </w:p>
-    <w:p>
-      <w:r>
-        <w:t>FAQ on Lambda, Istio, Mongo, Kafka-as-audit. Play 1 with the cheat sheet.</w:t>
-      </w:r>
-    </w:p>
-    <w:p>
-      <w:r>
-        <w:rPr>
-          <w:b/>
-        </w:rPr>
-        <w:t>DO NOT</w:t>
-      </w:r>
-    </w:p>
-    <w:p>
-      <w:r>
-        <w:t>Do not bash other teams' stacks. Do not agree to Istio 'because prod will need it'.</w:t>
-      </w:r>
-    </w:p>
-    <w:p>
-      <w:pPr>
-        <w:pStyle w:val="Heading2"/>
-      </w:pPr>
-      <w:r>
-        <w:t>Slide 17. 19 ARB prerequisites — traffic light for THIS sitting  (4 min · running 61)</w:t>
-      </w:r>
-    </w:p>
-    <w:p>
-      <w:r>
-        <w:rPr>
-          <w:b/>
-        </w:rPr>
-        <w:t>SAY</w:t>
-      </w:r>
-    </w:p>
-    <w:p>
-      <w:r>
-        <w:t>Nothing on this list is a reason to refuse two VPCs in the UAT account. Several are reasons to refuse production. Please keep those in different columns. The pack, PDF, Excel and this deck are the evidence index. Humans still sign CIS, Board 4, T4, VA/PT.</w:t>
-      </w:r>
-    </w:p>
-    <w:p>
-      <w:r>
-        <w:rPr>
-          <w:b/>
-        </w:rPr>
-        <w:t>IF ASKED</w:t>
-      </w:r>
-    </w:p>
-    <w:p>
-      <w:r>
-        <w:t>If they want every row green before Dev — that is production-ARB logic applied too early. Play 4.</w:t>
-      </w:r>
-    </w:p>
-    <w:p>
-      <w:r>
-        <w:rPr>
-          <w:b/>
-        </w:rPr>
-        <w:t>DO NOT</w:t>
-      </w:r>
-    </w:p>
-    <w:p>
-      <w:r>
-        <w:t>Do not mark VA/PT or CIS as done.</w:t>
-      </w:r>
-    </w:p>
-    <w:p>
-      <w:pPr>
-        <w:pStyle w:val="Heading2"/>
-      </w:pPr>
-      <w:r>
-        <w:t>Slide 18. What we need from ARB today  (3 min · running 64)</w:t>
-      </w:r>
-    </w:p>
-    <w:p>
-      <w:pPr>
-        <w:pStyle w:val="ListBullet"/>
-      </w:pPr>
-      <w:r>
-        <w:t>1. Recorded first-review of the R0 architecture as the intended design for NIP.</w:t>
-      </w:r>
-    </w:p>
-    <w:p>
-      <w:pPr>
-        <w:pStyle w:val="ListBullet"/>
-      </w:pPr>
-      <w:r>
-        <w:t>2. Non-objection to vendor: five accounts; UAT account with vpc-dev + vpc-uat; no CUG; no public ALB; no workload IGW.</w:t>
-      </w:r>
-    </w:p>
-    <w:p>
-      <w:pPr>
-        <w:pStyle w:val="ListBullet"/>
-      </w:pPr>
-      <w:r>
-        <w:t>3. Confirmation we attach to existing TGW / DX Gateway / EDGE — we do not clone them.</w:t>
-      </w:r>
-    </w:p>
-    <w:p>
-      <w:pPr>
-        <w:pStyle w:val="ListBullet"/>
-      </w:pPr>
-      <w:r>
-        <w:t>4. Observations and improvements, written. We will action them with owners and dates.</w:t>
-      </w:r>
-    </w:p>
-    <w:p>
-      <w:pPr>
-        <w:pStyle w:val="ListBullet"/>
-      </w:pPr>
-      <w:r>
-        <w:t>5. Explicitly out of scope today: prod apply, DR drill sign-off, CIS register, VA/PT, Apigee IP numbers.</w:t>
-      </w:r>
-    </w:p>
-    <w:p>
-      <w:r>
-        <w:rPr>
-          <w:b/>
-        </w:rPr>
-        <w:t>SAY</w:t>
-      </w:r>
-    </w:p>
-    <w:p>
-      <w:r>
-        <w:t>To close: we are asking for a first-review observation on this architecture, and a non-objection to vendor Dev-inside-UAT and UAT VPCs attaching to the existing bank network.</w:t>
-        <w:br/>
-        <w:br/>
-        <w:t>We are not asking for production, DR-ready, CIS classification, or a VA/PT waiver.</w:t>
-        <w:br/>
-        <w:br/>
-        <w:t>Observations and improvements are welcome. Anything that needs numbers we do not have, we will take as a dated action. Thank you.</w:t>
-      </w:r>
-    </w:p>
-    <w:p>
-      <w:r>
-        <w:rPr>
-          <w:b/>
-        </w:rPr>
-        <w:t>IF ASKED</w:t>
-      </w:r>
-    </w:p>
-    <w:p>
-      <w:r>
-        <w:t>If they will only write 'approved' — ask them to qualify: 'first review, Dev/UAT vending, production ARB still required'. Unqualified 'approved' is how we get blamed later.</w:t>
-      </w:r>
-    </w:p>
-    <w:p>
-      <w:r>
-        <w:rPr>
-          <w:b/>
-        </w:rPr>
-        <w:t>DO NOT</w:t>
-      </w:r>
-    </w:p>
-    <w:p>
-      <w:r>
-        <w:t>Do not leave without a written observation, even if it is 'no objection to Dev/UAT subject to Deepali on firewall remainder'.</w:t>
-      </w:r>
-    </w:p>
-    <w:p>
-      <w:pPr>
-        <w:pStyle w:val="Heading2"/>
-      </w:pPr>
-      <w:r>
-        <w:t>Slide 19. Parking lot — items that must not block Dev/UAT  (2 min · running 66)</w:t>
-      </w:r>
-    </w:p>
-    <w:p>
-      <w:pPr>
-        <w:pStyle w:val="ListBullet"/>
-      </w:pPr>
-      <w:r>
-        <w:t>DEP-20260914-apg — Apigee product + IPs (Shivanshi / API platform). Dev uses stubs.</w:t>
-      </w:r>
-    </w:p>
-    <w:p>
-      <w:pPr>
-        <w:pStyle w:val="ListBullet"/>
-      </w:pPr>
-      <w:r>
-        <w:t>DEP-20260824-dx1 — VPN then existing DX for UAT CBS. Dev stays on stubs.</w:t>
-      </w:r>
-    </w:p>
-    <w:p>
-      <w:pPr>
-        <w:pStyle w:val="ListBullet"/>
-      </w:pPr>
-      <w:r>
-        <w:t>ADR-010 remainder — Deepali accepts pod→Apigee inspection.</w:t>
-      </w:r>
-    </w:p>
-    <w:p>
-      <w:pPr>
-        <w:pStyle w:val="ListBullet"/>
-      </w:pPr>
-      <w:r>
-        <w:t>ID-11 — Fireframe SSO vs password-in-NIP (Deepali).</w:t>
-      </w:r>
-    </w:p>
-    <w:p>
-      <w:pPr>
-        <w:pStyle w:val="ListBullet"/>
-      </w:pPr>
-      <w:r>
-        <w:t>CAP-A* — Rajal volumes. NFR-DR-04 drill — Shivanshi, sitting 2.</w:t>
-      </w:r>
-    </w:p>
-    <w:p>
-      <w:pPr>
-        <w:pStyle w:val="ListBullet"/>
-      </w:pPr>
-      <w:r>
-        <w:t>Live capture in the room: ____________________________</w:t>
-      </w:r>
-    </w:p>
-    <w:p>
-      <w:r>
-        <w:rPr>
-          <w:b/>
-        </w:rPr>
-        <w:t>SAY</w:t>
-      </w:r>
-    </w:p>
-    <w:p>
-      <w:r>
-        <w:t>I will write every new question here with an owner. If it does not change CIDRs, attachments, or 'no public ALB', it does not block vending.</w:t>
-      </w:r>
-    </w:p>
-    <w:p>
-      <w:r>
-        <w:rPr>
-          <w:b/>
-        </w:rPr>
-        <w:t>DO NOT</w:t>
-      </w:r>
-    </w:p>
-    <w:p>
-      <w:r>
-        <w:t>Do not let the parking lot become a redesign workshop.</w:t>
-      </w:r>
-    </w:p>
-    <w:p>
-      <w:pPr>
-        <w:pStyle w:val="Heading2"/>
-      </w:pPr>
-      <w:r>
-        <w:t>Slide 20. Appendix — do not present unless asked  (appendix)</w:t>
-      </w:r>
-    </w:p>
-    <w:p>
-      <w:pPr>
-        <w:pStyle w:val="ListBullet"/>
-      </w:pPr>
-      <w:r>
-        <w:t>Next slides: network glossary in plain language, then FAQ we expect.</w:t>
-      </w:r>
-    </w:p>
-    <w:p>
-      <w:pPr>
-        <w:pStyle w:val="ListBullet"/>
-      </w:pPr>
-      <w:r>
-        <w:t>Leave-behind: PDF pack + Excel matrices + this deck.</w:t>
-      </w:r>
-    </w:p>
-    <w:p>
-      <w:pPr>
-        <w:pStyle w:val="ListBullet"/>
-      </w:pPr>
-      <w:r>
-        <w:t>Presenter: use presenter view — every slide has speaker notes.</w:t>
-      </w:r>
-    </w:p>
-    <w:p>
-      <w:pPr>
-        <w:pStyle w:val="ListBullet"/>
-      </w:pPr>
-      <w:r>
-        <w:t>If you do not know: Play 3. Never guess an IP or a pentest.</w:t>
-      </w:r>
-    </w:p>
-    <w:p>
-      <w:r>
-        <w:rPr>
-          <w:b/>
-        </w:rPr>
-        <w:t>SAY</w:t>
-      </w:r>
-    </w:p>
-    <w:p>
-      <w:r>
-        <w:t>We stop the main sitting here unless you want the glossary.</w:t>
-      </w:r>
-    </w:p>
-    <w:p>
-      <w:pPr>
-        <w:pStyle w:val="Heading2"/>
-      </w:pPr>
-      <w:r>
-        <w:t>Slide 21. Appendix A — network words in one sentence each  (appendix)</w:t>
-      </w:r>
-    </w:p>
-    <w:p>
-      <w:r>
-        <w:rPr>
-          <w:b/>
-        </w:rPr>
-        <w:t>SAY</w:t>
-      </w:r>
-    </w:p>
-    <w:p>
-      <w:r>
-        <w:t>If a network SME quizzes you, stay on this table. You do not need to configure BGP in this meeting.</w:t>
-      </w:r>
-    </w:p>
-    <w:p>
-      <w:r>
-        <w:rPr>
-          <w:b/>
-        </w:rPr>
-        <w:t>IF ASKED</w:t>
-      </w:r>
-    </w:p>
-    <w:p>
-      <w:r>
-        <w:t>If they go below this — Play 3, Shivanshi + bank network.</w:t>
-      </w:r>
-    </w:p>
-    <w:p>
-      <w:r>
-        <w:rPr>
-          <w:b/>
-        </w:rPr>
-        <w:t>DO NOT</w:t>
-      </w:r>
-    </w:p>
-    <w:p>
-      <w:r>
-        <w:t>Do not draw BGP on a whiteboard unless Shivanshi is speaking.</w:t>
-      </w:r>
-    </w:p>
-    <w:p>
-      <w:pPr>
-        <w:pStyle w:val="Heading2"/>
-      </w:pPr>
-      <w:r>
-        <w:t>Slide 22. Appendix B — five plays when you do not know  (appendix)</w:t>
-      </w:r>
-    </w:p>
-    <w:p>
-      <w:r>
-        <w:rPr>
-          <w:b/>
-        </w:rPr>
-        <w:t>SAY</w:t>
-      </w:r>
-    </w:p>
-    <w:p>
-      <w:r>
-        <w:t>These five sentences are how you stay professional without blocking Dev/UAT. Memorise Play 3 and Play 5.</w:t>
-      </w:r>
-    </w:p>
-    <w:p>
-      <w:r>
-        <w:rPr>
-          <w:b/>
-        </w:rPr>
-        <w:t>DO NOT</w:t>
-      </w:r>
-    </w:p>
-    <w:p>
-      <w:r>
-        <w:t>Do not read this slide in the main hour unless you are using a play live.</w:t>
-      </w:r>
-    </w:p>
-    <w:p>
-      <w:pPr>
-        <w:pStyle w:val="Heading2"/>
-      </w:pPr>
-      <w:r>
-        <w:t>Slide 23. Appendix C — questions we expect (answers in FAQ Excel)  (appendix)</w:t>
-      </w:r>
-    </w:p>
-    <w:p>
-      <w:r>
-        <w:rPr>
-          <w:b/>
-        </w:rPr>
-        <w:t>SAY</w:t>
-      </w:r>
-    </w:p>
-    <w:p>
-      <w:r>
-        <w:t>Flip here only if the room is circling. Full answers are in the FAQ workbook — 35 questions.</w:t>
-      </w:r>
-    </w:p>
-    <w:p>
-      <w:r>
-        <w:rPr>
-          <w:b/>
-        </w:rPr>
-        <w:t>DO NOT</w:t>
-      </w:r>
-    </w:p>
-    <w:p>
-      <w:r>
-        <w:t>Do not invent a 36th answer on the whiteboard.</w:t>
+        <w:t>Do not present this slide in the main walk.</w:t>
       </w:r>
     </w:p>
     <w:p>
@@ -1671,18 +881,12 @@
         <w:pStyle w:val="Heading1"/>
       </w:pPr>
       <w:r>
-        <w:t>Close — 45 seconds (memorise)</w:t>
+        <w:t>Close — 30 seconds</w:t>
       </w:r>
     </w:p>
     <w:p>
       <w:r>
-        <w:t>To close: we are asking for a first-review observation on this architecture, and a non-objection to vendor Dev-inside-UAT and UAT VPCs attaching to the existing bank network.</w:t>
-        <w:br/>
-        <w:br/>
-        <w:t>We are not asking for production, DR-ready, CIS classification, or a VA/PT waiver.</w:t>
-        <w:br/>
-        <w:br/>
-        <w:t>Observations and improvements are welcome. Anything that needs numbers we do not have, we will take as a dated action. Thank you.</w:t>
+        <w:t>The decision we are requesting: record this as the intended R0 design, and allow Dev and UAT to be provisioned on this shape. Production authority, DR proof and pentest belong to a later sitting. I will stop here so we can discuss.</w:t>
       </w:r>
     </w:p>
     <w:p>
@@ -1690,7 +894,7 @@
         <w:pStyle w:val="Heading1"/>
       </w:pPr>
       <w:r>
-        <w:t>FAQ (same as the Excel)</w:t>
+        <w:t>FAQ (same as the Excel — for the 25-minute discussion)</w:t>
       </w:r>
     </w:p>
     <w:p>
@@ -1703,7 +907,7 @@
     </w:p>
     <w:p>
       <w:r>
-        <w:t>Neighbour apps enter AWS on a Public ALB. NIP's AWS entry is API Gateway, then an Internal ALB only (ADR-018). Cloudflare and F5-XC already are the bank perimeter. A public ALB in front of API Gateway adds a hop and a public target group we do not need. Copying the neighbour pattern is a change to ADR-018 and a Deepali exposure decision — not a Dev convenience.</w:t>
+        <w:t>NIP's AWS entry is API Gateway, then an Internal ALB only (ADR-018). A public ALB in front of that front door adds a public target we do not need. Changing it is a Security exposure decision — not a Dev convenience.</w:t>
       </w:r>
     </w:p>
     <w:p>
@@ -1721,7 +925,7 @@
     </w:p>
     <w:p>
       <w:r>
-        <w:t>A public Dev is a production-shaped hole. Workload VPCs have no IGW in every environment. Internal ALB + API Gateway is the same shape in Dev, UAT and Prod. We will not invent a second ingress just to go faster.</w:t>
+        <w:t>A public Dev is a production-shaped hole. The workload has no internet gateway in every environment. We will not invent a second ingress to go faster.</w:t>
       </w:r>
     </w:p>
     <w:p>
@@ -1739,7 +943,7 @@
     </w:p>
     <w:p>
       <w:r>
-        <w:t>They do different jobs. API Gateway is the inbound AWS front door for RM/mobile and PG callbacks. Apigee is the bank outbound loading dock for 1SB and internal bank APIs (ADR-020). Flutter never calls Apigee. Java never calls 1SB. One product doing both would hairpin internal APIs through the public edge or force 1SB to allowlist the wrong IPs.</w:t>
+        <w:t>They do different jobs. API Gateway is inbound for RM/mobile and payment callbacks. Apigee is outbound for 1SB and internal bank APIs (ADR-020). One product doing both hairpins internal APIs through the public edge or allowlists the wrong IPs at 1SB.</w:t>
       </w:r>
     </w:p>
     <w:p>
@@ -1757,7 +961,7 @@
     </w:p>
     <w:p>
       <w:r>
-        <w:t>Human Architecture owner split the plane on 2026-09-14. Inbound stays API Gateway. Drawing Apigee on ingress would put RM traffic on the outbound plane and fight the existing Cloudflare→F5 path. We will not redesign that in this sitting.</w:t>
+        <w:t>Inbound stays API Gateway. Drawing Apigee on ingress puts RM traffic on the outbound plane. We will not redesign that in this sitting.</w:t>
       </w:r>
     </w:p>
     <w:p>
@@ -1775,7 +979,7 @@
     </w:p>
     <w:p>
       <w:r>
-        <w:t>If a workload VPC has an IGW, someone will eventually attach a public IP to a pod or an ALB. Zero-trust language on the landing-zone slide means the only IGW is on the inspection/EDGE path. You cannot curl a pod from the internet. That is intentional.</w:t>
+        <w:t>If a workload VPC has an IGW, someone will eventually attach a public IP. The only IGW is on the inspection path. You cannot curl a pod from the internet.</w:t>
       </w:r>
     </w:p>
     <w:p>
@@ -1793,7 +997,7 @@
     </w:p>
     <w:p>
       <w:r>
-        <w:t>Think of TGW as the bank's existing roundabout that already connects applications, EDGE firewalls and Direct Connect. We attach one spoke. We do not build an insurance-only roundabout. VPC peering meshes do not scale and would bypass hub inspection.</w:t>
+        <w:t>The estate roundabout that already connects applications, edge firewalls and Direct Connect. We attach one spoke. We do not build an insurance-only hub.</w:t>
       </w:r>
     </w:p>
     <w:p>
@@ -1811,7 +1015,7 @@
     </w:p>
     <w:p>
       <w:r>
-        <w:t>The bank already has AU-CTO-NETWORK TGW and DX Gateway. Cloning them is an A0 architecture defect (Board 1). Attach, do not clone (BE-01).</w:t>
+        <w:t>The estate already has them. Cloning them is an architecture defect. Attach, do not clone (BE-01).</w:t>
       </w:r>
     </w:p>
     <w:p>
@@ -1829,7 +1033,7 @@
     </w:p>
     <w:p>
       <w:r>
-        <w:t>NAT lets private pods start outbound connections. It still sits on the inspection VPC for the hop toward Apigee and remaining internet. It is not what 1SB allowlists. 1SB allowlists Apigee's egress IPs. Publishing our NAT Elastic IPs to 1SB allowlists the wrong host (ADR-020).</w:t>
+        <w:t>NAT lets private pods start outbound. It still sits on the inspection path toward Apigee. It is not what 1SB allowlists. 1SB allowlists Apigee's egress IPs (ADR-020).</w:t>
       </w:r>
     </w:p>
     <w:p>
@@ -1865,7 +1069,7 @@
     </w:p>
     <w:p>
       <w:r>
-        <w:t>FortiGate already exists in the hub EDGE VPC. Dropping another pair in the spoke would clone firewall operations the bank already staffs. Spoke NFW may inspect pod→Apigee; Deepali accepts that remainder. Hub FortiGate still inspects org paths.</w:t>
+        <w:t>FortiGate already exists in the hub edge VPC. Dropping another pair in the spoke clones firewall operations. Spoke NFW may inspect pod→Apigee; Security accepts that remainder.</w:t>
       </w:r>
     </w:p>
     <w:p>
@@ -1901,7 +1105,7 @@
     </w:p>
     <w:p>
       <w:r>
-        <w:t>Cloudflare Enterprise is the bank's north-south CDN/DDoS standard. CloudFront would be a second CDN the bank does not operate for this perimeter.</w:t>
+        <w:t>Cloudflare Enterprise is the north-south CDN/DDoS standard for this perimeter. CloudFront would be a second CDN for the same job.</w:t>
       </w:r>
     </w:p>
     <w:p>
@@ -1919,7 +1123,7 @@
     </w:p>
     <w:p>
       <w:r>
-        <w:t>We need HTTP path routing: / to nip-web, /api to BFF. That is ALB. A Service type LoadBalancer with a public IP is exactly the exposure we refused.</w:t>
+        <w:t>We need HTTP path routing: / to nip-web, /api to BFF. That is ALB. A Service type LoadBalancer with a public IP is the exposure we refused.</w:t>
       </w:r>
     </w:p>
     <w:p>
@@ -1937,7 +1141,7 @@
     </w:p>
     <w:p>
       <w:r>
-        <w:t>EKS is listed IaaS on this estate and already used. Lambda-for-everything does not match long-running insurance journeys, private VPC-only data stores, or the service boundaries we need for a second LOB later. We are not anti-Lambda; we are anti-rewriting the platform as functions to look modern.</w:t>
+        <w:t>EKS is listed IaaS on this estate. Lambda-for-everything does not match long-running insurance journeys or private VPC-only data stores. We are not anti-Lambda; we are anti-rewriting the platform as functions.</w:t>
       </w:r>
     </w:p>
     <w:p>
@@ -1955,7 +1159,7 @@
     </w:p>
     <w:p>
       <w:r>
-        <w:t>LTS, already in the programme, Spring Boot 3.5 in support, CVE overrides pinned in Gradle. A language war does not change a trust boundary. We will not restart R0 on a new runtime.</w:t>
+        <w:t>LTS, already in the programme, Spring Boot 3.5 in support. A language war does not change a trust boundary. We will not restart R0 on a new runtime.</w:t>
       </w:r>
     </w:p>
     <w:p>
@@ -1973,7 +1177,7 @@
     </w:p>
     <w:p>
       <w:r>
-        <w:t>Every rule change would be a release, and Health later becomes a rewrite. Suitability and quote are different systems of record. Boundaries are the point of R0, not premature micro-max.</w:t>
+        <w:t>Every rule change would be a release, and Health later becomes a rewrite. Suitability and quote are different systems of record.</w:t>
       </w:r>
     </w:p>
     <w:p>
@@ -2009,7 +1213,7 @@
     </w:p>
     <w:p>
       <w:r>
-        <w:t>AD is workforce only (TI-01). Partners must not enter AD. Keycloak (or equivalent) holds partner identities. Workforce verification is the existing AD-verify API, never LDAP from EKS. Fireframe/NIP-APP is the UI chrome.</w:t>
+        <w:t>AD is workforce only (TI-01). Partners must not enter AD. Workforce verification is the AD-verify API, never LDAP from EKS.</w:t>
       </w:r>
     </w:p>
     <w:p>
@@ -2027,7 +1231,7 @@
     </w:p>
     <w:p>
       <w:r>
-        <w:t>LDAP from a workload cluster to AD is a new credential path, a new secret, and a new blast radius. The bank already has an AD-verify API. We call it privately through Apigee.</w:t>
+        <w:t>LDAP from a workload cluster to AD is a new credential path and a new blast radius. The AD-verify API already exists. We call it privately through Apigee.</w:t>
       </w:r>
     </w:p>
     <w:p>
@@ -2045,7 +1249,7 @@
     </w:p>
     <w:p>
       <w:r>
-        <w:t>It is cost, with isolation by two VPCs, two route tables, namespaces, schemas and prefixes (ADR-020). Stubs cannot use the prod CBS route. A second AWS account is a Cloud exception we are not requesting.</w:t>
+        <w:t>Isolation is two VPCs, two route tables, namespaces, schemas and prefixes. Stubs cannot use the production CBS route. A second AWS account is a Cloud exception we are not requesting.</w:t>
       </w:r>
     </w:p>
     <w:p>
@@ -2063,7 +1267,7 @@
     </w:p>
     <w:p>
       <w:r>
-        <w:t>No R0 consumer for CUG. Waiver, do not provision (ASM-018). We will not pay for an empty class of environment.</w:t>
+        <w:t>No R0 consumer for CUG. Waiver, do not provision (ASM-018).</w:t>
       </w:r>
     </w:p>
     <w:p>
@@ -2081,7 +1285,7 @@
     </w:p>
     <w:p>
       <w:r>
-        <w:t>NFR RTO is 1 hour. Warm standby in ap-south-2 matches that. Active-active is a different money and data problem (RIA tier, Aarti, Shivanshi). We will not 'fix' SOP language in this hour without that evidence. DR proof is sitting 2.</w:t>
+        <w:t>NFR RTO is 1 hour. Warm standby in ap-south-2 matches that. Active-active is a different money and data problem. DR proof is sitting 2.</w:t>
       </w:r>
     </w:p>
     <w:p>
@@ -2099,7 +1303,7 @@
     </w:p>
     <w:p>
       <w:r>
-        <w:t>No. Designed, not drilled (NFR-DR-04). I will not claim a restore time we have not measured. That is exactly why this is not the production ARB.</w:t>
+        <w:t>No. Designed, not drilled (NFR-DR-04). I will not claim a restore time we have not measured.</w:t>
       </w:r>
     </w:p>
     <w:p>
@@ -2117,7 +1321,7 @@
     </w:p>
     <w:p>
       <w:r>
-        <w:t>Architecture proposes CIS because of CIF, KYC, health/suitability, payment orchestration and 7-year WORM audit. The bank CIS register is Shailja + CISO. We do not self-classify. Controls are already sized as if we were CIS — a lower class would be a written risk acceptance, not a cheaper Dev.</w:t>
+        <w:t>Architecture proposes CIS because of CIF, KYC, suitability, payment orchestration and 7-year WORM. The register is Compliance + CISO. We do not self-classify.</w:t>
       </w:r>
     </w:p>
     <w:p>
@@ -2153,7 +1357,7 @@
     </w:p>
     <w:p>
       <w:r>
-        <w:t>Search retention is not a 7-year licence evidence. Kafka topic retention is not WORM. Audit is INSERT-only + S3 Object Lock (TI-07, ADR-013). Operational logs can be rebuilt. Evidence cannot.</w:t>
+        <w:t>Search retention is not a 7-year licence evidence. Kafka topic retention is not WORM. Audit is INSERT-only + S3 Object Lock (TI-07, ADR-013).</w:t>
       </w:r>
     </w:p>
     <w:p>
@@ -2171,7 +1375,7 @@
     </w:p>
     <w:p>
       <w:r>
-        <w:t>C4 — customer-device payment. That is regulatory, not UX. UAT demos use a customer-device step, not an RM card entry.</w:t>
+        <w:t>Customer-device payment is a control, not a UX preference. UAT demos use a customer-device step.</w:t>
       </w:r>
     </w:p>
     <w:p>
@@ -2189,7 +1393,7 @@
     </w:p>
     <w:p>
       <w:r>
-        <w:t>R0 uses 1SB as a provider route behind an adapter (TI-04). Direct insurer APIs are an R1+ sibling adapter. The Hub contract does not change. We are not locked to 1SB JSON in the domain.</w:t>
+        <w:t>R0 uses 1SB as a provider route behind an adapter (TI-04). Direct insurer APIs are a later sibling adapter. The Hub contract does not change.</w:t>
       </w:r>
     </w:p>
     <w:p>
@@ -2202,12 +1406,12 @@
         <w:pStyle w:val="Heading2"/>
       </w:pPr>
       <w:r>
-        <w:t>Q29. Are we compliant with the bank landing-zone / SOP?</w:t>
+        <w:t>Q29. Are we compliant with the landing-zone / SOP?</w:t>
       </w:r>
     </w:p>
     <w:p>
       <w:r>
-        <w:t>We attach to Control Tower, TGW, DX, EDGE, GitLab, Terraform, IAM IC, India SCPs. Differences are recorded: API Gateway inbound not Public ALB; no CUG; Dev-inside-UAT; no workload IGW. Those are ADRs, not silent deviations. Human T4 still outstanding.</w:t>
+        <w:t>We attach to Control Tower, TGW, DX, EDGE, GitLab, Terraform, IAM IC, India SCPs. Differences are recorded ADRs: API Gateway inbound; no CUG; Dev-inside-UAT; no workload IGW. Human T4 still outstanding.</w:t>
       </w:r>
     </w:p>
     <w:p>
@@ -2225,7 +1429,7 @@
     </w:p>
     <w:p>
       <w:r>
-        <w:t>No. SOP: no public buckets. Authenticated app is not a brochure site. Static assets come through nip-web on the same ingress chain.</w:t>
+        <w:t>No. No public buckets. Authenticated app is not a brochure site. Static assets come through nip-web on the same ingress chain.</w:t>
       </w:r>
     </w:p>
     <w:p>
@@ -2243,7 +1447,7 @@
     </w:p>
     <w:p>
       <w:r>
-        <w:t>Not in R0. We already have NetworkPolicy, PDP, and two reverse proxies. A mesh is a new control plane with no named R0 problem (AP-09).</w:t>
+        <w:t>Not in R0. We already have NetworkPolicy, PDP, and two reverse proxies. A mesh is a new control plane with no named R0 problem.</w:t>
       </w:r>
     </w:p>
     <w:p>
@@ -2261,7 +1465,7 @@
     </w:p>
     <w:p>
       <w:r>
-        <w:t>Yes. Dev uses stubs for CBS/AD-verify. UAT needs VPN first, then existing DX as primary (ADR-009). Do not block vpc-dev on a carrier order.</w:t>
+        <w:t>Yes. Dev uses stubs. UAT needs VPN first, then existing DX as primary (ADR-009). Do not block vpc-dev on a carrier order.</w:t>
       </w:r>
     </w:p>
     <w:p>
@@ -2279,7 +1483,7 @@
     </w:p>
     <w:p>
       <w:r>
-        <w:t>A human Mahesh, not this deck. We draft; we do not sign. Same for Deepali Board 4 and Shailja CIS.</w:t>
+        <w:t>A human Mahesh, not this deck. We draft; we do not sign. Same for Security Board 4 and Compliance CIS.</w:t>
       </w:r>
     </w:p>
     <w:p>
@@ -2297,7 +1501,7 @@
     </w:p>
     <w:p>
       <w:r>
-        <w:t>India residency (TI-08) plus bank DR region already in use (ap-south-2). Data does not leave India.</w:t>
+        <w:t>India residency (TI-08) plus the DR region already in use (ap-south-2). Data does not leave India.</w:t>
       </w:r>
     </w:p>
     <w:p>
@@ -2315,7 +1519,7 @@
     </w:p>
     <w:p>
       <w:r>
-        <w:t>We cannot evidence timed DR, VA/PT, or CIS registration today. Forcing those now either invents evidence or delays Dev/UAT indefinitely. We ask for a staged review. Production ARB will be scheduled with that evidence.</w:t>
+        <w:t>We cannot evidence timed DR, VA/PT, or CIS registration today. Forcing those now either invents evidence or delays Dev/UAT indefinitely. We ask for a staged review.</w:t>
       </w:r>
     </w:p>
     <w:p>

</xml_diff>

<commit_message>
Illustrate the first ARB deck for a Dev/UAT design sitting
Replace text-box slides with geometric scenes: RM on NIP-APP, the sale ribbon, inbound/outbound hops, AWS and edge services, Java 21 / Flutter / orchestrated saga. Keep production evidence for the sitting after UAT.

Co-authored-by: mh.narkar <mh.narkar@gmail.com>
</commit_message>
<xml_diff>
--- a/docs/architecture/arb-prerequisites/exports/AU-NIP-R0-ARB-First-Review-SCRIPT-2026-09-14.docx
+++ b/docs/architecture/arb-prerequisites/exports/AU-NIP-R0-ARB-First-Review-SCRIPT-2026-09-14.docx
@@ -85,13 +85,13 @@
         <w:t>Good morning. This is the first architecture review of the Insurance Distribution Platform.</w:t>
         <w:br/>
         <w:br/>
-        <w:t>The slot is sixty minutes. I will take about thirty-five to walk the problem, the outcome we are building, and how this architecture does it. The remainder is for you — questions, observations, improvements.</w:t>
+        <w:t>Today we walk the intended design: the problem, one sale as it will actually run, the runtime, and the stack — so Dev and UAT can be stood up.</w:t>
         <w:br/>
         <w:br/>
-        <w:t>We are not seeking production authority today. We are seeking a recorded review of the intended design so Dev and UAT can be stood up.</w:t>
+        <w:t>We are not claiming production evidence. Working logs, security operations, compliance proofs and a proven day-one estate are what we bring after UAT, to a later sitting. A longer copy of this deck is not that sitting.</w:t>
         <w:br/>
         <w:br/>
-        <w:t>If a question needs a measured number we do not have, I will take it as a dated action. I will not guess an IP, a restore time, or a pentest result.</w:t>
+        <w:t>I will take about thirty-five minutes. The rest of the hour is yours.</w:t>
       </w:r>
     </w:p>
     <w:p>
@@ -196,13 +196,13 @@
         <w:t>Good morning. This is the first architecture review of the Insurance Distribution Platform.</w:t>
         <w:br/>
         <w:br/>
-        <w:t>The slot is sixty minutes. I will take about thirty-five to walk the problem, the outcome we are building, and how this architecture does it. The remainder is for you — questions, observations, improvements.</w:t>
+        <w:t>Today we walk the intended design: the problem, one sale as it will actually run, the runtime, and the stack — so Dev and UAT can be stood up.</w:t>
         <w:br/>
         <w:br/>
-        <w:t>We are not seeking production authority today. We are seeking a recorded review of the intended design so Dev and UAT can be stood up.</w:t>
+        <w:t>We are not claiming production evidence. Working logs, security operations, compliance proofs and a proven day-one estate are what we bring after UAT, to a later sitting. A longer copy of this deck is not that sitting.</w:t>
         <w:br/>
         <w:br/>
-        <w:t>If a question needs a measured number we do not have, I will take it as a dated action. I will not guess an IP, a restore time, or a pentest result.</w:t>
+        <w:t>I will take about thirty-five minutes. The rest of the hour is yours.</w:t>
       </w:r>
     </w:p>
     <w:p>
@@ -215,7 +215,7 @@
     </w:p>
     <w:p>
       <w:r>
-        <w:t>If someone asks whether this is production approval — no. Say it once, write it on the parking lot, keep walking.</w:t>
+        <w:t>If someone asks whether this is production approval — no. Say it once, park it, keep walking.</w:t>
       </w:r>
     </w:p>
     <w:p>
@@ -228,7 +228,7 @@
     </w:p>
     <w:p>
       <w:r>
-        <w:t>Do not say the architecture was designed by AI. Do not apologise for the design. Do not promise production in the same breath as Dev.</w:t>
+        <w:t>Do not say the architecture was designed by AI. Do not claim logs, VA/PT or DR drills as done.</w:t>
       </w:r>
     </w:p>
     <w:p>
@@ -236,7 +236,7 @@
         <w:pStyle w:val="Heading2"/>
       </w:pPr>
       <w:r>
-        <w:t>Slide 2. Purpose of this sitting  (1 min · running 2)</w:t>
+        <w:t>Slide 2. Two sittings — design now, evidence later  (2 min · running 3)</w:t>
       </w:r>
     </w:p>
     <w:p>
@@ -249,7 +249,7 @@
     </w:p>
     <w:p>
       <w:r>
-        <w:t>Thirty-five minutes from me so that twenty-five remain for the board. I will show the problem, the R0 outcome, then how a sale, a session, a partner call, identity, money and recovery actually work. Please hold deep dives until the discussion — I will pause after the topology picture if the room is already there.</w:t>
+        <w:t>Left is today: intended design, Dev and UAT, your comments. Right is after UAT: a production sitting with evidence that logging is capturing, security ops are running, compliance is in the pack, and the day-one services actually work. We will not pretend those proofs exist this morning.</w:t>
       </w:r>
     </w:p>
     <w:p>
@@ -262,7 +262,7 @@
     </w:p>
     <w:p>
       <w:r>
-        <w:t>If they want network first, skip to 'How a session reaches the application'. The problem slide can wait two minutes.</w:t>
+        <w:t>If they want one ARB for everything — we still cannot evidence a pentest of an unvended estate. Staged review matches how landing zones are vended.</w:t>
       </w:r>
     </w:p>
     <w:p>
@@ -275,7 +275,7 @@
     </w:p>
     <w:p>
       <w:r>
-        <w:t>Do not read a table of timings aloud. Point at the two clocks and move.</w:t>
+        <w:t>Do not promise a production date. Kalpana schedules sitting two after UAT.</w:t>
       </w:r>
     </w:p>
     <w:p>
@@ -283,7 +283,7 @@
         <w:pStyle w:val="Heading2"/>
       </w:pPr>
       <w:r>
-        <w:t>Slide 3. Why this platform exists  (3 min · running 5)</w:t>
+        <w:t>Slide 3. Why this platform exists  (2 min · running 5)</w:t>
       </w:r>
     </w:p>
     <w:p>
@@ -296,7 +296,7 @@
     </w:p>
     <w:p>
       <w:r>
-        <w:t>This is an insurance distribution problem, not a hosting problem. We hold a composite corporate-agency licence. If we cannot show suitability, customer consent, customer-device payment and a reconciled policy, we do not have a sale we can stand behind. That is why we are not wrapping someone else's portal.</w:t>
+        <w:t>Four pictures, one point: a licensed corporate agent must own the evidence of a Life sale. Suitability on the RM glass, OTP and premium on the customer phone, a policy only when money and issuance agree. Redirecting the customer to an aggregator site does not produce that pack.</w:t>
       </w:r>
     </w:p>
     <w:p>
@@ -309,7 +309,7 @@
     </w:p>
     <w:p>
       <w:r>
-        <w:t>Health, Motor and DIY are later horizons. Do not design them in this sitting.</w:t>
+        <w:t>Health, Motor and DIY are later horizons. Do not design them here.</w:t>
       </w:r>
     </w:p>
     <w:p>
@@ -322,7 +322,7 @@
     </w:p>
     <w:p>
       <w:r>
-        <w:t>Do not invent a Product signature. Rajal owns volumes and business sign-off.</w:t>
+        <w:t>Do not invent a Product signature.</w:t>
       </w:r>
     </w:p>
     <w:p>
@@ -330,7 +330,7 @@
         <w:pStyle w:val="Heading2"/>
       </w:pPr>
       <w:r>
-        <w:t>Slide 4. What R0 must deliver  (2 min · running 7)</w:t>
+        <w:t>Slide 4. How one sale actually runs  (5 min · running 10)</w:t>
       </w:r>
     </w:p>
     <w:p>
@@ -343,7 +343,7 @@
     </w:p>
     <w:p>
       <w:r>
-        <w:t>R0 is narrow on purpose: one RM, one ETB customer, one Group A insurer, assisted Life. Depth over breadth. The five bars on this slide are not features — they are gates. If a shortcut skips one of them, it is not a simplification.</w:t>
+        <w:t>Walk the ribbon left to right. The RM stands with NIP-APP. Suitability is a gate on that device — no quote without it. Consent and premium are the customer's phone, not the iPad. Quote and proposal go Hub then adapter. Policy is last, and only after reconciled. The gold line is an orchestrated saga: Journey Orchestration is the one record of where the sale is. Flutter never calls the aggregator, the database, or Apigee.</w:t>
       </w:r>
     </w:p>
     <w:p>
@@ -356,7 +356,7 @@
     </w:p>
     <w:p>
       <w:r>
-        <w:t>Volumes are still Product assumptions. They do not change the Dev/UAT network shape.</w:t>
+        <w:t>Why not one InsuranceService? Health later must not rewrite Life. Quote and suitability are different systems of record.</w:t>
       </w:r>
     </w:p>
     <w:p>
@@ -369,7 +369,7 @@
     </w:p>
     <w:p>
       <w:r>
-        <w:t>Do not expand into DIY, hybrid, or a second line of business to look more complete.</w:t>
+        <w:t>Do not accept RM-pays-for-the-customer as a UAT exception. Do not call Kafka the audit log.</w:t>
       </w:r>
     </w:p>
     <w:p>
@@ -377,7 +377,7 @@
         <w:pStyle w:val="Heading2"/>
       </w:pPr>
       <w:r>
-        <w:t>Slide 5. How one sale completes  (5 min · running 12)</w:t>
+        <w:t>Slide 5. How a session reaches the application  (3 min · running 13)</w:t>
       </w:r>
     </w:p>
     <w:p>
@@ -390,7 +390,7 @@
     </w:p>
     <w:p>
       <w:r>
-        <w:t>Forget boxes for a moment — this sequence is the architecture. Flutter never calls the aggregator, never calls the database, never calls Apigee. The customer phone appears twice: OTP and pay. If someone proposes collapsing quote and suitability into one service to look smaller, that is a control failure dressed as simplicity.</w:t>
+        <w:t>You cannot curl a pod from the internet. If asked why not a public ALB — it would put a public target in front of a front door we already have. ADR-018. That is a Security exposure decision, not a Dev convenience.</w:t>
       </w:r>
     </w:p>
     <w:p>
@@ -403,7 +403,7 @@
     </w:p>
     <w:p>
       <w:r>
-        <w:t>Why several services? Because a later Health journey must not rewrite Life. Different systems of record stay different.</w:t>
+        <w:t>FAQ on public ALB. Play 2 if they insist.</w:t>
       </w:r>
     </w:p>
     <w:p>
@@ -416,7 +416,7 @@
     </w:p>
     <w:p>
       <w:r>
-        <w:t>Do not call Kafka the audit log. Do not accept RM-pays-for-the-customer as a UAT exception.</w:t>
+        <w:t>Do not agree to a public ALB just for Dev.</w:t>
       </w:r>
     </w:p>
     <w:p>
@@ -424,7 +424,7 @@
         <w:pStyle w:val="Heading2"/>
       </w:pPr>
       <w:r>
-        <w:t>Slide 6. How a session reaches the application  (4 min · running 16)</w:t>
+        <w:t>Slide 6. How the platform calls a partner  (2 min · running 15)</w:t>
       </w:r>
     </w:p>
     <w:p>
@@ -437,7 +437,7 @@
     </w:p>
     <w:p>
       <w:r>
-        <w:t>A session is terminated at the edge, then at API Gateway, then at an internal load balancer. You cannot curl a pod from the internet — that is intentional. If the room asks why not a public ALB, the one-line answer is: it would add a public target in front of a front door we already have. That is ADR-018. Changing it is a Deepali exposure decision, not a Dev convenience. Do not agree to a public ALB 'just for Dev'.</w:t>
+        <w:t>The adapter base URL is the Apigee proxy, never the aggregator host. I will not read IPs. That action does not block vpc-dev.</w:t>
       </w:r>
     </w:p>
     <w:p>
@@ -450,7 +450,7 @@
     </w:p>
     <w:p>
       <w:r>
-        <w:t>Use FAQ on public ALB. Play 2 if they insist. Play 3 if they want a redesign in the last twenty minutes.</w:t>
+        <w:t>Play 3, DEP-20260914-apg. Dev uses stubs.</w:t>
       </w:r>
     </w:p>
     <w:p>
@@ -463,7 +463,7 @@
     </w:p>
     <w:p>
       <w:r>
-        <w:t>Do not contrast this with neighbour applications on the slide. Answer that only if asked, from the notes.</w:t>
+        <w:t>Do not invent IPs.</w:t>
       </w:r>
     </w:p>
     <w:p>
@@ -471,7 +471,7 @@
         <w:pStyle w:val="Heading2"/>
       </w:pPr>
       <w:r>
-        <w:t>Slide 7. How the platform calls a partner  (3 min · running 19)</w:t>
+        <w:t>Slide 7. Where a request runs  (2 min · running 17)</w:t>
       </w:r>
     </w:p>
     <w:p>
@@ -484,7 +484,7 @@
     </w:p>
     <w:p>
       <w:r>
-        <w:t>Two different outsides. Mixing them is how CIF ends up on the public internet. The adapter's base URL is the Apigee proxy, not the aggregator host. Publishing NAT Elastic IPs to 1SB allowlists the wrong host — ADR-020. I will not read out an IP list; that action sits with the Apigee team and does not block vpc-dev.</w:t>
+        <w:t>Attach as a spoke. Inbound as you saw. Outbound through Apigee. I will pause here if you want the drawing; otherwise I protect discussion time. If this picture disagrees with an ADR, the ADR wins.</w:t>
       </w:r>
     </w:p>
     <w:p>
@@ -497,7 +497,7 @@
     </w:p>
     <w:p>
       <w:r>
-        <w:t>Apigee edition and IPs: Play 3, DEP-20260914-apg. Dev uses stubs.</w:t>
+        <w:t>Previous two slides are the same facts in sequence.</w:t>
       </w:r>
     </w:p>
     <w:p>
@@ -510,7 +510,7 @@
     </w:p>
     <w:p>
       <w:r>
-        <w:t>Do not promise the Apigee product exists today. Do not invent IPs.</w:t>
+        <w:t>Do not walk every box.</w:t>
       </w:r>
     </w:p>
     <w:p>
@@ -518,7 +518,7 @@
         <w:pStyle w:val="Heading2"/>
       </w:pPr>
       <w:r>
-        <w:t>Slide 8. Where a request runs  (3 min · running 22)</w:t>
+        <w:t>Slide 8. How Dev and UAT are isolated  (1 min · running 18)</w:t>
       </w:r>
     </w:p>
     <w:p>
@@ -531,7 +531,7 @@
     </w:p>
     <w:p>
       <w:r>
-        <w:t>This is the runtime picture. Three facts: we attach as a spoke — we do not build a second hub. Inbound is the path you just saw. Outbound leaves through Apigee. The picture is a rendering of the LLD. If it disagrees with an ADR, the ADR wins. I will pause here if you want to interrogate the drawing; otherwise I will keep moving so we protect discussion time.</w:t>
+        <w:t>Five accounts. Dev is a VPC inside UAT, not a sixth account. Stubs cannot ride a production CBS route. Production is drawn so you see blast radius — we are not vending it today.</w:t>
       </w:r>
     </w:p>
     <w:p>
@@ -544,7 +544,7 @@
     </w:p>
     <w:p>
       <w:r>
-        <w:t>If the drawing is too busy, the previous two slides are the same facts in sequence.</w:t>
+        <w:t>Split Dev account is a Cloud exception we are not requesting.</w:t>
       </w:r>
     </w:p>
     <w:p>
@@ -557,7 +557,7 @@
     </w:p>
     <w:p>
       <w:r>
-        <w:t>Do not walk every box. Offer the LLD after the sitting.</w:t>
+        <w:t>Do not offer to vendor production while we are here.</w:t>
       </w:r>
     </w:p>
     <w:p>
@@ -565,7 +565,7 @@
         <w:pStyle w:val="Heading2"/>
       </w:pPr>
       <w:r>
-        <w:t>Slide 9. How Dev and UAT are isolated  (2 min · running 24)</w:t>
+        <w:t>Slide 9. What we run — edge, AWS, operate  (3 min · running 21)</w:t>
       </w:r>
     </w:p>
     <w:p>
@@ -578,7 +578,7 @@
     </w:p>
     <w:p>
       <w:r>
-        <w:t>Five accounts. Dev is not a sixth account — it is a VPC inside UAT, with its own route table, namespaces and schemas, so stubs cannot ride a production CBS route. CUG is not in R0; there is no consumer for it. Production is on this picture so you can see blast radius — we are not asking to vendor it today.</w:t>
+        <w:t>Four clusters, not a shopping list. Edge is Cloudflare, F5-XC, Apigee — they do not sit in our VPC. Compute is EKS behind API Gateway and an internal ALB. Data is Aurora PostgreSQL — one cluster, schema per context — not a public RDS. Events on MSK, fed by an outbox. Keys in KMS, secrets in Secrets Manager, telemetry in CloudWatch and CloudTrail. OpenSearch is operational search, not the audit pack.</w:t>
       </w:r>
     </w:p>
     <w:p>
@@ -591,7 +591,7 @@
     </w:p>
     <w:p>
       <w:r>
-        <w:t>A split Dev account is a Cloud cost exception we are not requesting. We can consume it; we are not asking for it.</w:t>
+        <w:t>Why not RDS? Aurora PostgreSQL is the recorded pin (ADR-008). Why not self-managed Kafka on EKS? MSK is the managed backbone; the outbox remains source of truth.</w:t>
       </w:r>
     </w:p>
     <w:p>
@@ -604,7 +604,7 @@
     </w:p>
     <w:p>
       <w:r>
-        <w:t>Do not offer to vendor production 'while we are here'.</w:t>
+        <w:t>Do not add Istio, Cognito, or a warehouse to look more complete. They are not R0.</w:t>
       </w:r>
     </w:p>
     <w:p>
@@ -612,7 +612,7 @@
         <w:pStyle w:val="Heading2"/>
       </w:pPr>
       <w:r>
-        <w:t>Slide 10. How identity, records and exposure are handled  (3 min · running 27)</w:t>
+        <w:t>Slide 10. How we build it  (3 min · running 24)</w:t>
       </w:r>
     </w:p>
     <w:p>
@@ -625,7 +625,7 @@
     </w:p>
     <w:p>
       <w:r>
-        <w:t>Please do not let anyone treat the search cluster as the audit pack. Search can be rebuilt. WORM cannot be shortened because we are in a hurry. We are not binding LDAP from Kubernetes to Active Directory — that would be a new credential path. VA/PT does not exist yet; we will not pentest an environment we have not been allowed to vendor.</w:t>
+        <w:t>Experience is Flutter — one project, web, APK, IPA. Services are Java 21 and Spring Boot 3.5 on EKS. Coordination is an orchestrated saga, not a choreography: Journey Orchestration is queryable when a sale stops. Outbox then MSK. 1SB JSON dies in the adapter. Tokens never reach the glass.</w:t>
       </w:r>
     </w:p>
     <w:p>
@@ -638,7 +638,7 @@
     </w:p>
     <w:p>
       <w:r>
-        <w:t>CIS class is a proposal; Shailja and CISO register it. Play 2. Play 4 on pentest.</w:t>
+        <w:t>They said Jetty — we run Java 21 LTS. Spring Boot 3.5 is the BOM in repo. Saga is recorded in the domain model §5, not a slide invention.</w:t>
       </w:r>
     </w:p>
     <w:p>
@@ -651,7 +651,7 @@
     </w:p>
     <w:p>
       <w:r>
-        <w:t>Do not classify the system into the CIS register from this slide. Do not say pentest is next week unless a date exists.</w:t>
+        <w:t>Do not start a language war. Do not claim a saga framework product — it is the Journey service plus state, not a third-party BPM.</w:t>
       </w:r>
     </w:p>
     <w:p>
@@ -659,7 +659,7 @@
         <w:pStyle w:val="Heading2"/>
       </w:pPr>
       <w:r>
-        <w:t>Slide 11. How premium is collected  (3 min · running 30)</w:t>
+        <w:t>Slide 11. How the services sit  (2 min · running 26)</w:t>
       </w:r>
     </w:p>
     <w:p>
@@ -672,7 +672,7 @@
     </w:p>
     <w:p>
       <w:r>
-        <w:t>Session-create goes out through Apigee. The customer completes 3-D Secure on their own device. The callback arrives on a separate API Gateway route, not on the RM session. We do not mark sold because a payment API returned 200. We wait for reconciled. If the callback is lost, state is uncertain and we block a second attempt. Timeouts do not mint money.</w:t>
+        <w:t>Five lanes. Flutter talks only to the BFF. The sale spine owns lead, saga, suitability, consent. Product owns catalogue, quote, proposal. Fulfilment owns payment, policy, WORM audit. Integration is Hub, 1SB adapter, Apigee. That is why Health later does not rewrite Life.</w:t>
       </w:r>
     </w:p>
     <w:p>
@@ -685,7 +685,7 @@
     </w:p>
     <w:p>
       <w:r>
-        <w:t>PAN never on the RM device and never in our logs. We use the bank payment gateway; we do not replace it.</w:t>
+        <w:t>Not every name is a pod today. R0 is the assisted Life cut of these lanes.</w:t>
       </w:r>
     </w:p>
     <w:p>
@@ -698,7 +698,7 @@
     </w:p>
     <w:p>
       <w:r>
-        <w:t>Do not accept 'RM pays on behalf for the UAT demo' as an architecture exception.</w:t>
+        <w:t>Do not list twenty class names. Stay on the lanes.</w:t>
       </w:r>
     </w:p>
     <w:p>
@@ -706,7 +706,7 @@
         <w:pStyle w:val="Heading2"/>
       </w:pPr>
       <w:r>
-        <w:t>Slide 12. Continuity — designed, not yet drilled  (2 min · running 32)</w:t>
+        <w:t>Slide 12. How premium is collected  (2 min · running 28)</w:t>
       </w:r>
     </w:p>
     <w:p>
@@ -719,7 +719,7 @@
     </w:p>
     <w:p>
       <w:r>
-        <w:t>Three numbers, one caveat: we have not measured them in a drill. That is exactly why this is not the production ARB. Warm standby matches a one-hour RTO. Active-active is a different money and data problem — I will not 'fix' SOP language in this hour without Aarti and Shivanshi.</w:t>
+        <w:t>Session-create through Apigee. Customer completes 3-D Secure on their phone. Callback on a separate API Gateway route. Sold waits for reconciled. Uncertain blocks a second attempt. Timeouts do not mint money.</w:t>
       </w:r>
     </w:p>
     <w:p>
@@ -732,7 +732,7 @@
     </w:p>
     <w:p>
       <w:r>
-        <w:t>Play 4. NFR-DR-04 is the drill.</w:t>
+        <w:t>PAN never on the RM device, never in logs.</w:t>
       </w:r>
     </w:p>
     <w:p>
@@ -745,7 +745,7 @@
     </w:p>
     <w:p>
       <w:r>
-        <w:t>Do not claim DR is proven. Do not drop Hyderabad 'to save money' without Aarti.</w:t>
+        <w:t>Do not accept RM pays on behalf for a demo.</w:t>
       </w:r>
     </w:p>
     <w:p>
@@ -753,7 +753,7 @@
         <w:pStyle w:val="Heading2"/>
       </w:pPr>
       <w:r>
-        <w:t>Slide 13. Decision requested  (2 min · running 34)</w:t>
+        <w:t>Slide 13. Continuity — designed, not yet drilled  (1 min · running 29)</w:t>
       </w:r>
     </w:p>
     <w:p>
@@ -766,7 +766,7 @@
     </w:p>
     <w:p>
       <w:r>
-        <w:t>The decision we are requesting: record this as the intended R0 design, and allow Dev and UAT to be provisioned on this shape. Production authority, DR proof and pentest belong to a later sitting. I will stop here so we can discuss.</w:t>
+        <w:t>Designed, not measured. That is why this is not the production ARB.</w:t>
       </w:r>
     </w:p>
     <w:p>
@@ -779,7 +779,7 @@
     </w:p>
     <w:p>
       <w:r>
-        <w:t>If they will only write 'approved', ask them to qualify: first review, Dev/UAT vending, production ARB still required.</w:t>
+        <w:t>Play 4. NFR-DR-04.</w:t>
       </w:r>
     </w:p>
     <w:p>
@@ -792,7 +792,7 @@
     </w:p>
     <w:p>
       <w:r>
-        <w:t>Do not leave without a written observation, even if it is 'no objection to Dev/UAT, firewall remainder with Security'.</w:t>
+        <w:t>Do not claim DR is proven.</w:t>
       </w:r>
     </w:p>
     <w:p>
@@ -800,7 +800,54 @@
         <w:pStyle w:val="Heading2"/>
       </w:pPr>
       <w:r>
-        <w:t>Slide 14. Appendix — network terms  (appendix)</w:t>
+        <w:t>Slide 14. Decision requested  (2 min · running 31)</w:t>
+      </w:r>
+    </w:p>
+    <w:p>
+      <w:r>
+        <w:rPr>
+          <w:b/>
+        </w:rPr>
+        <w:t>SAY</w:t>
+      </w:r>
+    </w:p>
+    <w:p>
+      <w:r>
+        <w:t>Please record this as the intended R0 design and allow Dev and UAT on this shape. When UAT has run, we return with evidence — logging, security ops, compliance, services on the path — not with a thicker version of these pictures. I will stop here so we can discuss.</w:t>
+      </w:r>
+    </w:p>
+    <w:p>
+      <w:r>
+        <w:rPr>
+          <w:b/>
+        </w:rPr>
+        <w:t>IF ASKED</w:t>
+      </w:r>
+    </w:p>
+    <w:p>
+      <w:r>
+        <w:t>If they write only 'approved', qualify: first review, Dev/UAT vending, production ARB still required.</w:t>
+      </w:r>
+    </w:p>
+    <w:p>
+      <w:r>
+        <w:rPr>
+          <w:b/>
+        </w:rPr>
+        <w:t>DO NOT</w:t>
+      </w:r>
+    </w:p>
+    <w:p>
+      <w:r>
+        <w:t>Do not leave without a written observation.</w:t>
+      </w:r>
+    </w:p>
+    <w:p>
+      <w:pPr>
+        <w:pStyle w:val="Heading2"/>
+      </w:pPr>
+      <w:r>
+        <w:t>Slide 15. Appendix — network terms  (appendix)</w:t>
       </w:r>
     </w:p>
     <w:p>
@@ -847,7 +894,7 @@
         <w:pStyle w:val="Heading2"/>
       </w:pPr>
       <w:r>
-        <w:t>Slide 15. Appendix — if you do not have the number  (appendix)</w:t>
+        <w:t>Slide 16. Appendix — if you do not have the number  (appendix)</w:t>
       </w:r>
     </w:p>
     <w:p>
@@ -886,7 +933,7 @@
     </w:p>
     <w:p>
       <w:r>
-        <w:t>The decision we are requesting: record this as the intended R0 design, and allow Dev and UAT to be provisioned on this shape. Production authority, DR proof and pentest belong to a later sitting. I will stop here so we can discuss.</w:t>
+        <w:t>Please record this as the intended R0 design and allow Dev and UAT on this shape. When UAT has run, we return with evidence — logging, security ops, compliance, services on the path — not with a thicker version of these pictures. I will stop here so we can discuss.</w:t>
       </w:r>
     </w:p>
     <w:p>
@@ -1172,7 +1219,79 @@
         <w:pStyle w:val="Heading2"/>
       </w:pPr>
       <w:r>
-        <w:t>Q16. Why not one InsuranceService monolith?</w:t>
+        <w:t>Q16. Is that Jetty 21?</w:t>
+      </w:r>
+    </w:p>
+    <w:p>
+      <w:r>
+        <w:t>No. The runtime pin is Java 21 LTS with Spring Boot 3.5. Jetty is not the recorded server pin.</w:t>
+      </w:r>
+    </w:p>
+    <w:p>
+      <w:r>
+        <w:t>Cite: Lifecycle paper / Gradle BOM. Answer from the ADR — do not defer this one.</w:t>
+      </w:r>
+    </w:p>
+    <w:p>
+      <w:pPr>
+        <w:pStyle w:val="Heading2"/>
+      </w:pPr>
+      <w:r>
+        <w:t>Q17. Are you using Postgres RDS?</w:t>
+      </w:r>
+    </w:p>
+    <w:p>
+      <w:r>
+        <w:t>Aurora PostgreSQL — one cluster, schema per bounded context (ADR-008). Not a public RDS instance, not one database per microservice at R0.</w:t>
+      </w:r>
+    </w:p>
+    <w:p>
+      <w:r>
+        <w:t>Cite: ADR-008 / LLD BOM. Answer from the ADR — do not defer this one.</w:t>
+      </w:r>
+    </w:p>
+    <w:p>
+      <w:pPr>
+        <w:pStyle w:val="Heading2"/>
+      </w:pPr>
+      <w:r>
+        <w:t>Q18. Why Saga? Is this a BPM product?</w:t>
+      </w:r>
+    </w:p>
+    <w:p>
+      <w:r>
+        <w:t>Orchestrated saga owned by Journey Orchestration (#9). Not choreography, not a third-party BPM. One queryable record of where the sale is and why it stopped. Domain model §5.</w:t>
+      </w:r>
+    </w:p>
+    <w:p>
+      <w:r>
+        <w:t>Cite: 01-domain-model §5 / HLD 2.6. Answer from the ADR — do not defer this one.</w:t>
+      </w:r>
+    </w:p>
+    <w:p>
+      <w:pPr>
+        <w:pStyle w:val="Heading2"/>
+      </w:pPr>
+      <w:r>
+        <w:t>Q19. When do we see production logging and security evidence?</w:t>
+      </w:r>
+    </w:p>
+    <w:p>
+      <w:r>
+        <w:t>After UAT. This sitting is intended design for Dev/UAT. Sitting two brings working logs, security ops, compliance pack, VA/PT and a timed restore. We will not invent those proofs today.</w:t>
+      </w:r>
+    </w:p>
+    <w:p>
+      <w:r>
+        <w:t>Cite: This sitting's ask. Answer from the ADR — do not defer this one.</w:t>
+      </w:r>
+    </w:p>
+    <w:p>
+      <w:pPr>
+        <w:pStyle w:val="Heading2"/>
+      </w:pPr>
+      <w:r>
+        <w:t>Q20. Why not one InsuranceService monolith?</w:t>
       </w:r>
     </w:p>
     <w:p>
@@ -1190,7 +1309,7 @@
         <w:pStyle w:val="Heading2"/>
       </w:pPr>
       <w:r>
-        <w:t>Q17. Why Flutter?</w:t>
+        <w:t>Q21. Why Flutter?</w:t>
       </w:r>
     </w:p>
     <w:p>
@@ -1208,7 +1327,7 @@
         <w:pStyle w:val="Heading2"/>
       </w:pPr>
       <w:r>
-        <w:t>Q18. Why Keycloak if we have Active Directory?</w:t>
+        <w:t>Q22. Why Keycloak if we have Active Directory?</w:t>
       </w:r>
     </w:p>
     <w:p>
@@ -1226,7 +1345,7 @@
         <w:pStyle w:val="Heading2"/>
       </w:pPr>
       <w:r>
-        <w:t>Q19. Why not LDAP from EKS to AD? It is simpler.</w:t>
+        <w:t>Q23. Why not LDAP from EKS to AD? It is simpler.</w:t>
       </w:r>
     </w:p>
     <w:p>
@@ -1244,7 +1363,7 @@
         <w:pStyle w:val="Heading2"/>
       </w:pPr>
       <w:r>
-        <w:t>Q20. Why is Dev inside UAT? That is not isolation.</w:t>
+        <w:t>Q24. Why is Dev inside UAT? That is not isolation.</w:t>
       </w:r>
     </w:p>
     <w:p>
@@ -1262,7 +1381,7 @@
         <w:pStyle w:val="Heading2"/>
       </w:pPr>
       <w:r>
-        <w:t>Q21. Why no CUG?</w:t>
+        <w:t>Q25. Why no CUG?</w:t>
       </w:r>
     </w:p>
     <w:p>
@@ -1280,7 +1399,7 @@
         <w:pStyle w:val="Heading2"/>
       </w:pPr>
       <w:r>
-        <w:t>Q22. Why warm standby, not active-active?</w:t>
+        <w:t>Q26. Why warm standby, not active-active?</w:t>
       </w:r>
     </w:p>
     <w:p>
@@ -1298,7 +1417,7 @@
         <w:pStyle w:val="Heading2"/>
       </w:pPr>
       <w:r>
-        <w:t>Q23. Is DR proven?</w:t>
+        <w:t>Q27. Is DR proven?</w:t>
       </w:r>
     </w:p>
     <w:p>
@@ -1316,7 +1435,7 @@
         <w:pStyle w:val="Heading2"/>
       </w:pPr>
       <w:r>
-        <w:t>Q24. Is this a Critical Information System?</w:t>
+        <w:t>Q28. Is this a Critical Information System?</w:t>
       </w:r>
     </w:p>
     <w:p>
@@ -1334,7 +1453,7 @@
         <w:pStyle w:val="Heading2"/>
       </w:pPr>
       <w:r>
-        <w:t>Q25. Where is the VA/PT report?</w:t>
+        <w:t>Q29. Where is the VA/PT report?</w:t>
       </w:r>
     </w:p>
     <w:p>
@@ -1352,7 +1471,7 @@
         <w:pStyle w:val="Heading2"/>
       </w:pPr>
       <w:r>
-        <w:t>Q26. Why isn't OpenSearch / Kafka the audit store?</w:t>
+        <w:t>Q30. Why isn't OpenSearch / Kafka the audit store?</w:t>
       </w:r>
     </w:p>
     <w:p>
@@ -1370,7 +1489,7 @@
         <w:pStyle w:val="Heading2"/>
       </w:pPr>
       <w:r>
-        <w:t>Q27. Why can't the RM pay on the iPad for the customer?</w:t>
+        <w:t>Q31. Why can't the RM pay on the iPad for the customer?</w:t>
       </w:r>
     </w:p>
     <w:p>
@@ -1388,7 +1507,7 @@
         <w:pStyle w:val="Heading2"/>
       </w:pPr>
       <w:r>
-        <w:t>Q28. Why 1SB at all? Why not call insurers directly?</w:t>
+        <w:t>Q32. Why 1SB at all? Why not call insurers directly?</w:t>
       </w:r>
     </w:p>
     <w:p>
@@ -1406,7 +1525,7 @@
         <w:pStyle w:val="Heading2"/>
       </w:pPr>
       <w:r>
-        <w:t>Q29. Are we compliant with the landing-zone / SOP?</w:t>
+        <w:t>Q33. Are we compliant with the landing-zone / SOP?</w:t>
       </w:r>
     </w:p>
     <w:p>
@@ -1424,7 +1543,7 @@
         <w:pStyle w:val="Heading2"/>
       </w:pPr>
       <w:r>
-        <w:t>Q30. Can we put Flutter on public S3?</w:t>
+        <w:t>Q34. Can we put Flutter on public S3?</w:t>
       </w:r>
     </w:p>
     <w:p>
@@ -1442,7 +1561,7 @@
         <w:pStyle w:val="Heading2"/>
       </w:pPr>
       <w:r>
-        <w:t>Q31. Why not Istio / service mesh in R0?</w:t>
+        <w:t>Q35. Why not Istio / service mesh in R0?</w:t>
       </w:r>
     </w:p>
     <w:p>
@@ -1460,7 +1579,7 @@
         <w:pStyle w:val="Heading2"/>
       </w:pPr>
       <w:r>
-        <w:t>Q32. Can we start Dev without Direct Connect?</w:t>
+        <w:t>Q36. Can we start Dev without Direct Connect?</w:t>
       </w:r>
     </w:p>
     <w:p>
@@ -1478,7 +1597,7 @@
         <w:pStyle w:val="Heading2"/>
       </w:pPr>
       <w:r>
-        <w:t>Q33. Who signs T4 Architecture?</w:t>
+        <w:t>Q37. Who signs T4 Architecture?</w:t>
       </w:r>
     </w:p>
     <w:p>
@@ -1496,7 +1615,7 @@
         <w:pStyle w:val="Heading2"/>
       </w:pPr>
       <w:r>
-        <w:t>Q34. Why Hyderabad, not another region?</w:t>
+        <w:t>Q38. Why Hyderabad, not another region?</w:t>
       </w:r>
     </w:p>
     <w:p>
@@ -1514,7 +1633,7 @@
         <w:pStyle w:val="Heading2"/>
       </w:pPr>
       <w:r>
-        <w:t>Q35. What if ARB wants a full production pack today?</w:t>
+        <w:t>Q39. What if ARB wants a full production pack today?</w:t>
       </w:r>
     </w:p>
     <w:p>

</xml_diff>